<commit_message>
Added additional user and tab option selection
</commit_message>
<xml_diff>
--- a/SETUP-Info.docx
+++ b/SETUP-Info.docx
@@ -58,6 +58,7 @@
       <w:r>
         <w:t xml:space="preserve">Use </w:t>
       </w:r>
+      <w:proofErr w:type="spellStart"/>
       <w:r>
         <w:rPr>
           <w:b/>
@@ -65,6 +66,7 @@
         </w:rPr>
         <w:t>ngrok</w:t>
       </w:r>
+      <w:proofErr w:type="spellEnd"/>
       <w:r>
         <w:t xml:space="preserve"> → temporary public URL </w:t>
       </w:r>
@@ -157,7 +159,23 @@
           <w:b/>
           <w:bCs/>
         </w:rPr>
-        <w:t xml:space="preserve"> Best Solution (Simple + Free-ish)</w:t>
+        <w:t xml:space="preserve"> Best Solution (Simple + Free-</w:t>
+      </w:r>
+      <w:proofErr w:type="spellStart"/>
+      <w:r>
+        <w:rPr>
+          <w:b/>
+          <w:bCs/>
+        </w:rPr>
+        <w:t>ish</w:t>
+      </w:r>
+      <w:proofErr w:type="spellEnd"/>
+      <w:r>
+        <w:rPr>
+          <w:b/>
+          <w:bCs/>
+        </w:rPr>
+        <w:t>)</w:t>
       </w:r>
     </w:p>
     <w:p>
@@ -237,7 +255,15 @@
         </w:numPr>
       </w:pPr>
       <w:r>
-        <w:t xml:space="preserve">No ngrok needed </w:t>
+        <w:t xml:space="preserve">No </w:t>
+      </w:r>
+      <w:proofErr w:type="spellStart"/>
+      <w:r>
+        <w:t>ngrok</w:t>
+      </w:r>
+      <w:proofErr w:type="spellEnd"/>
+      <w:r>
+        <w:t xml:space="preserve"> needed </w:t>
       </w:r>
     </w:p>
     <w:p>
@@ -287,7 +313,23 @@
     </w:p>
     <w:p>
       <w:r>
-        <w:t>from flask import Flask, render_template, request, redirect, send_file, flash</w:t>
+        <w:t xml:space="preserve">from flask import Flask, </w:t>
+      </w:r>
+      <w:proofErr w:type="spellStart"/>
+      <w:r>
+        <w:t>render_template</w:t>
+      </w:r>
+      <w:proofErr w:type="spellEnd"/>
+      <w:r>
+        <w:t xml:space="preserve">, request, redirect, </w:t>
+      </w:r>
+      <w:proofErr w:type="spellStart"/>
+      <w:r>
+        <w:t>send_file</w:t>
+      </w:r>
+      <w:proofErr w:type="spellEnd"/>
+      <w:r>
+        <w:t>, flash</w:t>
       </w:r>
       <w:r>
         <w:br/>
@@ -299,18 +341,36 @@
       </w:r>
       <w:r>
         <w:br/>
-        <w:t>from io import BytesIO</w:t>
-      </w:r>
-      <w:r>
-        <w:br/>
-        <w:t>import os</w:t>
-      </w:r>
-      <w:r>
-        <w:br/>
-      </w:r>
-      <w:r>
-        <w:br/>
-        <w:t>DB_NAME = "inventory.db"</w:t>
+        <w:t xml:space="preserve">from io import </w:t>
+      </w:r>
+      <w:proofErr w:type="spellStart"/>
+      <w:r>
+        <w:t>BytesIO</w:t>
+      </w:r>
+      <w:proofErr w:type="spellEnd"/>
+      <w:r>
+        <w:br/>
+        <w:t xml:space="preserve">import </w:t>
+      </w:r>
+      <w:proofErr w:type="spellStart"/>
+      <w:r>
+        <w:t>os</w:t>
+      </w:r>
+      <w:proofErr w:type="spellEnd"/>
+      <w:r>
+        <w:br/>
+      </w:r>
+      <w:r>
+        <w:br/>
+        <w:t>DB_NAME = "</w:t>
+      </w:r>
+      <w:proofErr w:type="spellStart"/>
+      <w:r>
+        <w:t>inventory.db</w:t>
+      </w:r>
+      <w:proofErr w:type="spellEnd"/>
+      <w:r>
+        <w:t>"</w:t>
       </w:r>
       <w:r>
         <w:br/>
@@ -319,9 +379,22 @@
       <w:r>
         <w:br/>
       </w:r>
+      <w:proofErr w:type="spellStart"/>
       <w:r>
         <w:lastRenderedPageBreak/>
-        <w:t>app.secret_key = os.environ.get("SECRET_KEY", "supersecret")</w:t>
+        <w:t>app.secret_key</w:t>
+      </w:r>
+      <w:proofErr w:type="spellEnd"/>
+      <w:r>
+        <w:t xml:space="preserve"> = </w:t>
+      </w:r>
+      <w:proofErr w:type="spellStart"/>
+      <w:r>
+        <w:t>os.environ.get</w:t>
+      </w:r>
+      <w:proofErr w:type="spellEnd"/>
+      <w:r>
+        <w:t>("SECRET_KEY", "supersecret")</w:t>
       </w:r>
       <w:r>
         <w:br/>
@@ -332,7 +405,15 @@
       </w:r>
       <w:r>
         <w:br/>
-        <w:t>def init_db():</w:t>
+        <w:t xml:space="preserve">def </w:t>
+      </w:r>
+      <w:proofErr w:type="spellStart"/>
+      <w:r>
+        <w:t>init_db</w:t>
+      </w:r>
+      <w:proofErr w:type="spellEnd"/>
+      <w:r>
+        <w:t>():</w:t>
       </w:r>
       <w:r>
         <w:br/>
@@ -340,11 +421,27 @@
       </w:r>
       <w:r>
         <w:br/>
-        <w:t xml:space="preserve">    cursor = conn.cursor()</w:t>
-      </w:r>
-      <w:r>
-        <w:br/>
-        <w:t xml:space="preserve">    cursor.execute("""</w:t>
+        <w:t xml:space="preserve">    cursor = </w:t>
+      </w:r>
+      <w:proofErr w:type="spellStart"/>
+      <w:r>
+        <w:t>conn.cursor</w:t>
+      </w:r>
+      <w:proofErr w:type="spellEnd"/>
+      <w:r>
+        <w:t>()</w:t>
+      </w:r>
+      <w:r>
+        <w:br/>
+        <w:t xml:space="preserve">    </w:t>
+      </w:r>
+      <w:proofErr w:type="spellStart"/>
+      <w:r>
+        <w:t>cursor.execute</w:t>
+      </w:r>
+      <w:proofErr w:type="spellEnd"/>
+      <w:r>
+        <w:t>("""</w:t>
       </w:r>
       <w:r>
         <w:br/>
@@ -352,11 +449,27 @@
       </w:r>
       <w:r>
         <w:br/>
-        <w:t xml:space="preserve">            product_no TEXT PRIMARY KEY,</w:t>
-      </w:r>
-      <w:r>
-        <w:br/>
-        <w:t xml:space="preserve">            item_name TEXT,</w:t>
+        <w:t xml:space="preserve">            </w:t>
+      </w:r>
+      <w:proofErr w:type="spellStart"/>
+      <w:r>
+        <w:t>product_no</w:t>
+      </w:r>
+      <w:proofErr w:type="spellEnd"/>
+      <w:r>
+        <w:t xml:space="preserve"> TEXT PRIMARY KEY,</w:t>
+      </w:r>
+      <w:r>
+        <w:br/>
+        <w:t xml:space="preserve">            </w:t>
+      </w:r>
+      <w:proofErr w:type="spellStart"/>
+      <w:r>
+        <w:t>item_name</w:t>
+      </w:r>
+      <w:proofErr w:type="spellEnd"/>
+      <w:r>
+        <w:t xml:space="preserve"> TEXT,</w:t>
       </w:r>
       <w:r>
         <w:br/>
@@ -372,18 +485,42 @@
       </w:r>
       <w:r>
         <w:br/>
-        <w:t xml:space="preserve">    conn.commit()</w:t>
-      </w:r>
-      <w:r>
-        <w:br/>
-        <w:t xml:space="preserve">    conn.close()</w:t>
-      </w:r>
-      <w:r>
-        <w:br/>
-      </w:r>
-      <w:r>
-        <w:br/>
-        <w:t>def run_query(query, params=()):</w:t>
+        <w:t xml:space="preserve">    </w:t>
+      </w:r>
+      <w:proofErr w:type="spellStart"/>
+      <w:r>
+        <w:t>conn.commit</w:t>
+      </w:r>
+      <w:proofErr w:type="spellEnd"/>
+      <w:r>
+        <w:t>()</w:t>
+      </w:r>
+      <w:r>
+        <w:br/>
+        <w:t xml:space="preserve">    </w:t>
+      </w:r>
+      <w:proofErr w:type="spellStart"/>
+      <w:r>
+        <w:t>conn.close</w:t>
+      </w:r>
+      <w:proofErr w:type="spellEnd"/>
+      <w:r>
+        <w:t>()</w:t>
+      </w:r>
+      <w:r>
+        <w:br/>
+      </w:r>
+      <w:r>
+        <w:br/>
+        <w:t xml:space="preserve">def </w:t>
+      </w:r>
+      <w:proofErr w:type="spellStart"/>
+      <w:r>
+        <w:t>run_query</w:t>
+      </w:r>
+      <w:proofErr w:type="spellEnd"/>
+      <w:r>
+        <w:t>(query, params=()):</w:t>
       </w:r>
       <w:r>
         <w:br/>
@@ -391,23 +528,63 @@
       </w:r>
       <w:r>
         <w:br/>
-        <w:t xml:space="preserve">    cursor = conn.cursor()</w:t>
-      </w:r>
-      <w:r>
-        <w:br/>
-        <w:t xml:space="preserve">    cursor.execute(query, params)</w:t>
-      </w:r>
-      <w:r>
-        <w:br/>
-        <w:t xml:space="preserve">    conn.commit()</w:t>
-      </w:r>
-      <w:r>
-        <w:br/>
-        <w:t xml:space="preserve">    data = cursor.fetchall()</w:t>
-      </w:r>
-      <w:r>
-        <w:br/>
-        <w:t xml:space="preserve">    conn.close()</w:t>
+        <w:t xml:space="preserve">    cursor = </w:t>
+      </w:r>
+      <w:proofErr w:type="spellStart"/>
+      <w:r>
+        <w:t>conn.cursor</w:t>
+      </w:r>
+      <w:proofErr w:type="spellEnd"/>
+      <w:r>
+        <w:t>()</w:t>
+      </w:r>
+      <w:r>
+        <w:br/>
+        <w:t xml:space="preserve">    </w:t>
+      </w:r>
+      <w:proofErr w:type="spellStart"/>
+      <w:r>
+        <w:t>cursor.execute</w:t>
+      </w:r>
+      <w:proofErr w:type="spellEnd"/>
+      <w:r>
+        <w:t>(query, params)</w:t>
+      </w:r>
+      <w:r>
+        <w:br/>
+        <w:t xml:space="preserve">    </w:t>
+      </w:r>
+      <w:proofErr w:type="spellStart"/>
+      <w:r>
+        <w:t>conn.commit</w:t>
+      </w:r>
+      <w:proofErr w:type="spellEnd"/>
+      <w:r>
+        <w:t>()</w:t>
+      </w:r>
+      <w:r>
+        <w:br/>
+        <w:t xml:space="preserve">    data = </w:t>
+      </w:r>
+      <w:proofErr w:type="spellStart"/>
+      <w:r>
+        <w:t>cursor.fetchall</w:t>
+      </w:r>
+      <w:proofErr w:type="spellEnd"/>
+      <w:r>
+        <w:t>()</w:t>
+      </w:r>
+      <w:r>
+        <w:br/>
+        <w:t xml:space="preserve">    </w:t>
+      </w:r>
+      <w:proofErr w:type="spellStart"/>
+      <w:r>
+        <w:t>conn.close</w:t>
+      </w:r>
+      <w:proofErr w:type="spellEnd"/>
+      <w:r>
+        <w:t>()</w:t>
       </w:r>
       <w:r>
         <w:br/>
@@ -430,19 +607,51 @@
       </w:r>
       <w:r>
         <w:br/>
-        <w:t xml:space="preserve">    if request.method == "POST":</w:t>
-      </w:r>
-      <w:r>
-        <w:br/>
-        <w:t xml:space="preserve">        product = request.form.get("product").strip()</w:t>
-      </w:r>
-      <w:r>
-        <w:br/>
-        <w:t xml:space="preserve">        name = request.form.get("name").strip()</w:t>
-      </w:r>
-      <w:r>
-        <w:br/>
-        <w:t xml:space="preserve">        qty = request.form.get("quantity").strip()</w:t>
+        <w:t xml:space="preserve">    if </w:t>
+      </w:r>
+      <w:proofErr w:type="spellStart"/>
+      <w:r>
+        <w:t>request.method</w:t>
+      </w:r>
+      <w:proofErr w:type="spellEnd"/>
+      <w:r>
+        <w:t xml:space="preserve"> == "POST":</w:t>
+      </w:r>
+      <w:r>
+        <w:br/>
+        <w:t xml:space="preserve">        product = </w:t>
+      </w:r>
+      <w:proofErr w:type="spellStart"/>
+      <w:r>
+        <w:t>request.form.get</w:t>
+      </w:r>
+      <w:proofErr w:type="spellEnd"/>
+      <w:r>
+        <w:t>("product").strip()</w:t>
+      </w:r>
+      <w:r>
+        <w:br/>
+        <w:t xml:space="preserve">        name = </w:t>
+      </w:r>
+      <w:proofErr w:type="spellStart"/>
+      <w:r>
+        <w:t>request.form.get</w:t>
+      </w:r>
+      <w:proofErr w:type="spellEnd"/>
+      <w:r>
+        <w:t>("name").strip()</w:t>
+      </w:r>
+      <w:r>
+        <w:br/>
+        <w:t xml:space="preserve">        qty = </w:t>
+      </w:r>
+      <w:proofErr w:type="spellStart"/>
+      <w:r>
+        <w:t>request.form.get</w:t>
+      </w:r>
+      <w:proofErr w:type="spellEnd"/>
+      <w:r>
+        <w:t>("quantity").strip()</w:t>
       </w:r>
       <w:r>
         <w:br/>
@@ -454,7 +663,15 @@
       </w:r>
       <w:r>
         <w:br/>
-        <w:t xml:space="preserve">            run_query("INSERT INTO inventory VALUES (?, ?, ?)", (product, name, qty))</w:t>
+        <w:t xml:space="preserve">            </w:t>
+      </w:r>
+      <w:proofErr w:type="spellStart"/>
+      <w:r>
+        <w:t>run_query</w:t>
+      </w:r>
+      <w:proofErr w:type="spellEnd"/>
+      <w:r>
+        <w:t>("INSERT INTO inventory VALUES (?, ?, ?)", (product, name, qty))</w:t>
       </w:r>
       <w:r>
         <w:br/>
@@ -480,11 +697,27 @@
       </w:r>
       <w:r>
         <w:br/>
-        <w:t xml:space="preserve">    items = run_query("SELECT * FROM inventory")</w:t>
-      </w:r>
-      <w:r>
-        <w:br/>
-        <w:t xml:space="preserve">    return render_template("index.html", items=items)</w:t>
+        <w:t xml:space="preserve">    items = </w:t>
+      </w:r>
+      <w:proofErr w:type="spellStart"/>
+      <w:r>
+        <w:t>run_query</w:t>
+      </w:r>
+      <w:proofErr w:type="spellEnd"/>
+      <w:r>
+        <w:t>("SELECT * FROM inventory")</w:t>
+      </w:r>
+      <w:r>
+        <w:br/>
+        <w:t xml:space="preserve">    return </w:t>
+      </w:r>
+      <w:proofErr w:type="spellStart"/>
+      <w:r>
+        <w:t>render_template</w:t>
+      </w:r>
+      <w:proofErr w:type="spellEnd"/>
+      <w:r>
+        <w:t>("index.html", items=items)</w:t>
       </w:r>
       <w:r>
         <w:br/>
@@ -495,11 +728,43 @@
       </w:r>
       <w:r>
         <w:br/>
-        <w:t>def delete(product_no):</w:t>
-      </w:r>
-      <w:r>
-        <w:br/>
-        <w:t xml:space="preserve">    run_query("DELETE FROM inventory WHERE product_no=?", (product_no,))</w:t>
+        <w:t>def delete(</w:t>
+      </w:r>
+      <w:proofErr w:type="spellStart"/>
+      <w:r>
+        <w:t>product_no</w:t>
+      </w:r>
+      <w:proofErr w:type="spellEnd"/>
+      <w:r>
+        <w:t>):</w:t>
+      </w:r>
+      <w:r>
+        <w:br/>
+        <w:t xml:space="preserve">    </w:t>
+      </w:r>
+      <w:proofErr w:type="spellStart"/>
+      <w:r>
+        <w:t>run_query</w:t>
+      </w:r>
+      <w:proofErr w:type="spellEnd"/>
+      <w:r>
+        <w:t xml:space="preserve">("DELETE FROM inventory WHERE </w:t>
+      </w:r>
+      <w:proofErr w:type="spellStart"/>
+      <w:r>
+        <w:t>product_no</w:t>
+      </w:r>
+      <w:proofErr w:type="spellEnd"/>
+      <w:r>
+        <w:t>=?", (</w:t>
+      </w:r>
+      <w:proofErr w:type="spellStart"/>
+      <w:r>
+        <w:t>product_no</w:t>
+      </w:r>
+      <w:proofErr w:type="spellEnd"/>
+      <w:r>
+        <w:t>,))</w:t>
       </w:r>
       <w:r>
         <w:br/>
@@ -518,15 +783,39 @@
       </w:r>
       <w:r>
         <w:br/>
-        <w:t>def edit(product_no):</w:t>
-      </w:r>
-      <w:r>
-        <w:br/>
-        <w:t xml:space="preserve">    if request.method == "POST":</w:t>
-      </w:r>
-      <w:r>
-        <w:br/>
-        <w:t xml:space="preserve">        qty = request.form.get("quantity")</w:t>
+        <w:t>def edit(</w:t>
+      </w:r>
+      <w:proofErr w:type="spellStart"/>
+      <w:r>
+        <w:t>product_no</w:t>
+      </w:r>
+      <w:proofErr w:type="spellEnd"/>
+      <w:r>
+        <w:t>):</w:t>
+      </w:r>
+      <w:r>
+        <w:br/>
+        <w:t xml:space="preserve">    if </w:t>
+      </w:r>
+      <w:proofErr w:type="spellStart"/>
+      <w:r>
+        <w:t>request.method</w:t>
+      </w:r>
+      <w:proofErr w:type="spellEnd"/>
+      <w:r>
+        <w:t xml:space="preserve"> == "POST":</w:t>
+      </w:r>
+      <w:r>
+        <w:br/>
+        <w:t xml:space="preserve">        qty = </w:t>
+      </w:r>
+      <w:proofErr w:type="spellStart"/>
+      <w:r>
+        <w:t>request.form.get</w:t>
+      </w:r>
+      <w:proofErr w:type="spellEnd"/>
+      <w:r>
+        <w:t>("quantity")</w:t>
       </w:r>
       <w:r>
         <w:br/>
@@ -538,7 +827,31 @@
       </w:r>
       <w:r>
         <w:br/>
-        <w:t xml:space="preserve">            run_query("UPDATE inventory SET quantity=? WHERE product_no=?", (qty, product_no))</w:t>
+        <w:t xml:space="preserve">            </w:t>
+      </w:r>
+      <w:proofErr w:type="spellStart"/>
+      <w:r>
+        <w:t>run_query</w:t>
+      </w:r>
+      <w:proofErr w:type="spellEnd"/>
+      <w:r>
+        <w:t xml:space="preserve">("UPDATE inventory SET quantity=? WHERE </w:t>
+      </w:r>
+      <w:proofErr w:type="spellStart"/>
+      <w:r>
+        <w:t>product_no</w:t>
+      </w:r>
+      <w:proofErr w:type="spellEnd"/>
+      <w:r>
+        <w:t xml:space="preserve">=?", (qty, </w:t>
+      </w:r>
+      <w:proofErr w:type="spellStart"/>
+      <w:r>
+        <w:t>product_no</w:t>
+      </w:r>
+      <w:proofErr w:type="spellEnd"/>
+      <w:r>
+        <w:t>))</w:t>
       </w:r>
       <w:r>
         <w:br/>
@@ -561,11 +874,43 @@
       </w:r>
       <w:r>
         <w:br/>
-        <w:t xml:space="preserve">    item = run_query("SELECT * FROM inventory WHERE product_no=?", (product_no,))</w:t>
-      </w:r>
-      <w:r>
-        <w:br/>
-        <w:t xml:space="preserve">    return render_template("edit.html", item=item[0])</w:t>
+        <w:t xml:space="preserve">    item = </w:t>
+      </w:r>
+      <w:proofErr w:type="spellStart"/>
+      <w:r>
+        <w:t>run_query</w:t>
+      </w:r>
+      <w:proofErr w:type="spellEnd"/>
+      <w:r>
+        <w:t xml:space="preserve">("SELECT * FROM inventory WHERE </w:t>
+      </w:r>
+      <w:proofErr w:type="spellStart"/>
+      <w:r>
+        <w:t>product_no</w:t>
+      </w:r>
+      <w:proofErr w:type="spellEnd"/>
+      <w:r>
+        <w:t>=?", (</w:t>
+      </w:r>
+      <w:proofErr w:type="spellStart"/>
+      <w:r>
+        <w:t>product_no</w:t>
+      </w:r>
+      <w:proofErr w:type="spellEnd"/>
+      <w:r>
+        <w:t>,))</w:t>
+      </w:r>
+      <w:r>
+        <w:br/>
+        <w:t xml:space="preserve">    return </w:t>
+      </w:r>
+      <w:proofErr w:type="spellStart"/>
+      <w:r>
+        <w:t>render_template</w:t>
+      </w:r>
+      <w:proofErr w:type="spellEnd"/>
+      <w:r>
+        <w:t>("edit.html", item=item[0])</w:t>
       </w:r>
       <w:r>
         <w:br/>
@@ -580,7 +925,15 @@
       </w:r>
       <w:r>
         <w:br/>
-        <w:t xml:space="preserve">    file = request.files.get("file")</w:t>
+        <w:t xml:space="preserve">    file = </w:t>
+      </w:r>
+      <w:proofErr w:type="spellStart"/>
+      <w:r>
+        <w:t>request.files.get</w:t>
+      </w:r>
+      <w:proofErr w:type="spellEnd"/>
+      <w:r>
+        <w:t>("file")</w:t>
       </w:r>
       <w:r>
         <w:br/>
@@ -599,19 +952,67 @@
       </w:r>
       <w:r>
         <w:br/>
-        <w:t xml:space="preserve">    df = pd.read_excel(file)</w:t>
-      </w:r>
-      <w:r>
-        <w:br/>
-        <w:t xml:space="preserve">    existing = set(x[0] for x in run_query("SELECT product_no FROM inventory"))</w:t>
-      </w:r>
-      <w:r>
-        <w:br/>
-        <w:t xml:space="preserve">    new_count = 0</w:t>
-      </w:r>
-      <w:r>
-        <w:br/>
-        <w:t xml:space="preserve">    duplicate_count = 0</w:t>
+        <w:t xml:space="preserve">    </w:t>
+      </w:r>
+      <w:proofErr w:type="spellStart"/>
+      <w:r>
+        <w:t>df</w:t>
+      </w:r>
+      <w:proofErr w:type="spellEnd"/>
+      <w:r>
+        <w:t xml:space="preserve"> = </w:t>
+      </w:r>
+      <w:proofErr w:type="spellStart"/>
+      <w:r>
+        <w:t>pd.read_excel</w:t>
+      </w:r>
+      <w:proofErr w:type="spellEnd"/>
+      <w:r>
+        <w:t>(file)</w:t>
+      </w:r>
+      <w:r>
+        <w:br/>
+        <w:t xml:space="preserve">    existing = set(x[0] for x in </w:t>
+      </w:r>
+      <w:proofErr w:type="spellStart"/>
+      <w:r>
+        <w:t>run_query</w:t>
+      </w:r>
+      <w:proofErr w:type="spellEnd"/>
+      <w:r>
+        <w:t xml:space="preserve">("SELECT </w:t>
+      </w:r>
+      <w:proofErr w:type="spellStart"/>
+      <w:r>
+        <w:t>product_no</w:t>
+      </w:r>
+      <w:proofErr w:type="spellEnd"/>
+      <w:r>
+        <w:t xml:space="preserve"> FROM inventory"))</w:t>
+      </w:r>
+      <w:r>
+        <w:br/>
+        <w:t xml:space="preserve">    </w:t>
+      </w:r>
+      <w:proofErr w:type="spellStart"/>
+      <w:r>
+        <w:t>new_count</w:t>
+      </w:r>
+      <w:proofErr w:type="spellEnd"/>
+      <w:r>
+        <w:t xml:space="preserve"> = 0</w:t>
+      </w:r>
+      <w:r>
+        <w:br/>
+        <w:t xml:space="preserve">    </w:t>
+      </w:r>
+      <w:proofErr w:type="spellStart"/>
+      <w:r>
+        <w:t>duplicate_count</w:t>
+      </w:r>
+      <w:proofErr w:type="spellEnd"/>
+      <w:r>
+        <w:t xml:space="preserve"> = 0</w:t>
       </w:r>
       <w:r>
         <w:br/>
@@ -619,22 +1020,54 @@
       <w:r>
         <w:lastRenderedPageBreak/>
         <w:br/>
-        <w:t xml:space="preserve">    for _, row in df.iterrows():</w:t>
-      </w:r>
-      <w:r>
-        <w:br/>
-        <w:t xml:space="preserve">        product = str(row.iloc[0]).strip()</w:t>
-      </w:r>
-      <w:r>
-        <w:br/>
-        <w:t xml:space="preserve">        name = str(row.iloc[1]).strip()</w:t>
-      </w:r>
-      <w:r>
-        <w:br/>
-      </w:r>
-      <w:r>
-        <w:br/>
-        <w:t xml:space="preserve">        if not product or product.lower() == "nan":</w:t>
+        <w:t xml:space="preserve">    for _, row in </w:t>
+      </w:r>
+      <w:proofErr w:type="spellStart"/>
+      <w:r>
+        <w:t>df.iterrows</w:t>
+      </w:r>
+      <w:proofErr w:type="spellEnd"/>
+      <w:r>
+        <w:t>():</w:t>
+      </w:r>
+      <w:r>
+        <w:br/>
+        <w:t xml:space="preserve">        product = str(</w:t>
+      </w:r>
+      <w:proofErr w:type="spellStart"/>
+      <w:r>
+        <w:t>row.iloc</w:t>
+      </w:r>
+      <w:proofErr w:type="spellEnd"/>
+      <w:r>
+        <w:t>[0]).strip()</w:t>
+      </w:r>
+      <w:r>
+        <w:br/>
+        <w:t xml:space="preserve">        name = str(</w:t>
+      </w:r>
+      <w:proofErr w:type="spellStart"/>
+      <w:r>
+        <w:t>row.iloc</w:t>
+      </w:r>
+      <w:proofErr w:type="spellEnd"/>
+      <w:r>
+        <w:t>[1]).strip()</w:t>
+      </w:r>
+      <w:r>
+        <w:br/>
+      </w:r>
+      <w:r>
+        <w:br/>
+        <w:t xml:space="preserve">        if not product or </w:t>
+      </w:r>
+      <w:proofErr w:type="spellStart"/>
+      <w:r>
+        <w:t>product.lower</w:t>
+      </w:r>
+      <w:proofErr w:type="spellEnd"/>
+      <w:r>
+        <w:t>() == "nan":</w:t>
       </w:r>
       <w:r>
         <w:br/>
@@ -649,7 +1082,15 @@
       </w:r>
       <w:r>
         <w:br/>
-        <w:t xml:space="preserve">            duplicate_count += 1</w:t>
+        <w:t xml:space="preserve">            </w:t>
+      </w:r>
+      <w:proofErr w:type="spellStart"/>
+      <w:r>
+        <w:t>duplicate_count</w:t>
+      </w:r>
+      <w:proofErr w:type="spellEnd"/>
+      <w:r>
+        <w:t xml:space="preserve"> += 1</w:t>
       </w:r>
       <w:r>
         <w:br/>
@@ -660,22 +1101,70 @@
       </w:r>
       <w:r>
         <w:br/>
-        <w:t xml:space="preserve">        run_query("INSERT INTO inventory VALUES (?, ?, ?)", (product, name, None))</w:t>
-      </w:r>
-      <w:r>
-        <w:br/>
-        <w:t xml:space="preserve">        existing.add(product)</w:t>
-      </w:r>
-      <w:r>
-        <w:br/>
-        <w:t xml:space="preserve">        new_count += 1</w:t>
-      </w:r>
-      <w:r>
-        <w:br/>
-      </w:r>
-      <w:r>
-        <w:br/>
-        <w:t xml:space="preserve">    flash(f"Upload Summary: New: {new_count}, Duplicates: {duplicate_count}", "info")</w:t>
+        <w:t xml:space="preserve">        </w:t>
+      </w:r>
+      <w:proofErr w:type="spellStart"/>
+      <w:r>
+        <w:t>run_query</w:t>
+      </w:r>
+      <w:proofErr w:type="spellEnd"/>
+      <w:r>
+        <w:t>("INSERT INTO inventory VALUES (?, ?, ?)", (product, name, None))</w:t>
+      </w:r>
+      <w:r>
+        <w:br/>
+        <w:t xml:space="preserve">        </w:t>
+      </w:r>
+      <w:proofErr w:type="spellStart"/>
+      <w:r>
+        <w:t>existing.add</w:t>
+      </w:r>
+      <w:proofErr w:type="spellEnd"/>
+      <w:r>
+        <w:t>(product)</w:t>
+      </w:r>
+      <w:r>
+        <w:br/>
+        <w:t xml:space="preserve">        </w:t>
+      </w:r>
+      <w:proofErr w:type="spellStart"/>
+      <w:r>
+        <w:t>new_count</w:t>
+      </w:r>
+      <w:proofErr w:type="spellEnd"/>
+      <w:r>
+        <w:t xml:space="preserve"> += 1</w:t>
+      </w:r>
+      <w:r>
+        <w:br/>
+      </w:r>
+      <w:r>
+        <w:br/>
+        <w:t xml:space="preserve">    flash(</w:t>
+      </w:r>
+      <w:proofErr w:type="spellStart"/>
+      <w:r>
+        <w:t>f"Upload</w:t>
+      </w:r>
+      <w:proofErr w:type="spellEnd"/>
+      <w:r>
+        <w:t xml:space="preserve"> Summary: New: {</w:t>
+      </w:r>
+      <w:proofErr w:type="spellStart"/>
+      <w:r>
+        <w:t>new_count</w:t>
+      </w:r>
+      <w:proofErr w:type="spellEnd"/>
+      <w:r>
+        <w:t>}, Duplicates: {</w:t>
+      </w:r>
+      <w:proofErr w:type="spellStart"/>
+      <w:r>
+        <w:t>duplicate_count</w:t>
+      </w:r>
+      <w:proofErr w:type="spellEnd"/>
+      <w:r>
+        <w:t>}", "info")</w:t>
       </w:r>
       <w:r>
         <w:br/>
@@ -694,33 +1183,105 @@
       </w:r>
       <w:r>
         <w:br/>
-        <w:t xml:space="preserve">    data = run_query("SELECT * FROM inventory")</w:t>
-      </w:r>
-      <w:r>
-        <w:br/>
-        <w:t xml:space="preserve">    df = pd.DataFrame(data, columns=["Product#", "Item Name", "Quantity"])</w:t>
-      </w:r>
-      <w:r>
-        <w:br/>
-      </w:r>
-      <w:r>
-        <w:br/>
-        <w:t xml:space="preserve">    output = BytesIO()</w:t>
-      </w:r>
-      <w:r>
-        <w:br/>
-        <w:t xml:space="preserve">    df.to_excel(output, index=False)</w:t>
-      </w:r>
-      <w:r>
-        <w:br/>
-        <w:t xml:space="preserve">    output.seek(0)</w:t>
-      </w:r>
-      <w:r>
-        <w:br/>
-      </w:r>
-      <w:r>
-        <w:br/>
-        <w:t xml:space="preserve">    return send_file(output, download_name="inventory.xlsx", as_attachment=True)</w:t>
+        <w:t xml:space="preserve">    data = </w:t>
+      </w:r>
+      <w:proofErr w:type="spellStart"/>
+      <w:r>
+        <w:t>run_query</w:t>
+      </w:r>
+      <w:proofErr w:type="spellEnd"/>
+      <w:r>
+        <w:t>("SELECT * FROM inventory")</w:t>
+      </w:r>
+      <w:r>
+        <w:br/>
+        <w:t xml:space="preserve">    </w:t>
+      </w:r>
+      <w:proofErr w:type="spellStart"/>
+      <w:r>
+        <w:t>df</w:t>
+      </w:r>
+      <w:proofErr w:type="spellEnd"/>
+      <w:r>
+        <w:t xml:space="preserve"> = </w:t>
+      </w:r>
+      <w:proofErr w:type="spellStart"/>
+      <w:r>
+        <w:t>pd.DataFrame</w:t>
+      </w:r>
+      <w:proofErr w:type="spellEnd"/>
+      <w:r>
+        <w:t>(data, columns=["Product#", "Item Name", "Quantity"])</w:t>
+      </w:r>
+      <w:r>
+        <w:br/>
+      </w:r>
+      <w:r>
+        <w:br/>
+        <w:t xml:space="preserve">    output = </w:t>
+      </w:r>
+      <w:proofErr w:type="spellStart"/>
+      <w:r>
+        <w:t>BytesIO</w:t>
+      </w:r>
+      <w:proofErr w:type="spellEnd"/>
+      <w:r>
+        <w:t>()</w:t>
+      </w:r>
+      <w:r>
+        <w:br/>
+        <w:t xml:space="preserve">    </w:t>
+      </w:r>
+      <w:proofErr w:type="spellStart"/>
+      <w:r>
+        <w:t>df.to_excel</w:t>
+      </w:r>
+      <w:proofErr w:type="spellEnd"/>
+      <w:r>
+        <w:t>(output, index=False)</w:t>
+      </w:r>
+      <w:r>
+        <w:br/>
+        <w:t xml:space="preserve">    </w:t>
+      </w:r>
+      <w:proofErr w:type="spellStart"/>
+      <w:r>
+        <w:t>output.seek</w:t>
+      </w:r>
+      <w:proofErr w:type="spellEnd"/>
+      <w:r>
+        <w:t>(0)</w:t>
+      </w:r>
+      <w:r>
+        <w:br/>
+      </w:r>
+      <w:r>
+        <w:br/>
+        <w:t xml:space="preserve">    return </w:t>
+      </w:r>
+      <w:proofErr w:type="spellStart"/>
+      <w:r>
+        <w:t>send_file</w:t>
+      </w:r>
+      <w:proofErr w:type="spellEnd"/>
+      <w:r>
+        <w:t xml:space="preserve">(output, </w:t>
+      </w:r>
+      <w:proofErr w:type="spellStart"/>
+      <w:r>
+        <w:t>download_name</w:t>
+      </w:r>
+      <w:proofErr w:type="spellEnd"/>
+      <w:r>
+        <w:t xml:space="preserve">="inventory.xlsx", </w:t>
+      </w:r>
+      <w:proofErr w:type="spellStart"/>
+      <w:r>
+        <w:t>as_attachment</w:t>
+      </w:r>
+      <w:proofErr w:type="spellEnd"/>
+      <w:r>
+        <w:t>=True)</w:t>
       </w:r>
       <w:r>
         <w:br/>
@@ -735,15 +1296,39 @@
       </w:r>
       <w:r>
         <w:br/>
-        <w:t xml:space="preserve">    init_db()</w:t>
-      </w:r>
-      <w:r>
-        <w:br/>
-        <w:t xml:space="preserve">    port = int(os.environ.get("PORT", 10000))</w:t>
-      </w:r>
-      <w:r>
-        <w:br/>
-        <w:t xml:space="preserve">    app.run(host="0.0.0.0", port=port)</w:t>
+        <w:t xml:space="preserve">    </w:t>
+      </w:r>
+      <w:proofErr w:type="spellStart"/>
+      <w:r>
+        <w:t>init_db</w:t>
+      </w:r>
+      <w:proofErr w:type="spellEnd"/>
+      <w:r>
+        <w:t>()</w:t>
+      </w:r>
+      <w:r>
+        <w:br/>
+        <w:t xml:space="preserve">    port = int(</w:t>
+      </w:r>
+      <w:proofErr w:type="spellStart"/>
+      <w:r>
+        <w:t>os.environ.get</w:t>
+      </w:r>
+      <w:proofErr w:type="spellEnd"/>
+      <w:r>
+        <w:t>("PORT", 10000))</w:t>
+      </w:r>
+      <w:r>
+        <w:br/>
+        <w:t xml:space="preserve">    </w:t>
+      </w:r>
+      <w:proofErr w:type="spellStart"/>
+      <w:r>
+        <w:t>app.run</w:t>
+      </w:r>
+      <w:proofErr w:type="spellEnd"/>
+      <w:r>
+        <w:t>(host="0.0.0.0", port=port)</w:t>
       </w:r>
     </w:p>
     <w:p>
@@ -802,12 +1387,20 @@
       </w:r>
       <w:r>
         <w:br/>
+      </w:r>
+      <w:proofErr w:type="spellStart"/>
+      <w:r>
         <w:t>openpyxl</w:t>
       </w:r>
-      <w:r>
-        <w:br/>
+      <w:proofErr w:type="spellEnd"/>
+      <w:r>
+        <w:br/>
+      </w:r>
+      <w:proofErr w:type="spellStart"/>
+      <w:r>
         <w:t>gunicorn</w:t>
       </w:r>
+      <w:proofErr w:type="spellEnd"/>
     </w:p>
     <w:p>
       <w:r>
@@ -828,13 +1421,42 @@
           <w:b/>
           <w:bCs/>
         </w:rPr>
-        <w:t>2. Procfile (VERY IMPORTANT)</w:t>
-      </w:r>
-    </w:p>
-    <w:p>
-      <w:r>
-        <w:t>web: gunicorn app:app</w:t>
-      </w:r>
+        <w:t xml:space="preserve">2. </w:t>
+      </w:r>
+      <w:proofErr w:type="spellStart"/>
+      <w:r>
+        <w:rPr>
+          <w:b/>
+          <w:bCs/>
+        </w:rPr>
+        <w:t>Procfile</w:t>
+      </w:r>
+      <w:proofErr w:type="spellEnd"/>
+      <w:r>
+        <w:rPr>
+          <w:b/>
+          <w:bCs/>
+        </w:rPr>
+        <w:t xml:space="preserve"> (VERY IMPORTANT)</w:t>
+      </w:r>
+    </w:p>
+    <w:p>
+      <w:r>
+        <w:t xml:space="preserve">web: </w:t>
+      </w:r>
+      <w:proofErr w:type="spellStart"/>
+      <w:r>
+        <w:t>gunicorn</w:t>
+      </w:r>
+      <w:proofErr w:type="spellEnd"/>
+      <w:r>
+        <w:t xml:space="preserve"> </w:t>
+      </w:r>
+      <w:proofErr w:type="spellStart"/>
+      <w:r>
+        <w:t>app:app</w:t>
+      </w:r>
+      <w:proofErr w:type="spellEnd"/>
     </w:p>
     <w:p>
       <w:r>
@@ -946,8 +1568,12 @@
       </w:r>
       <w:r>
         <w:br/>
+      </w:r>
+      <w:proofErr w:type="spellStart"/>
+      <w:r>
         <w:t>Procfile</w:t>
       </w:r>
+      <w:proofErr w:type="spellEnd"/>
       <w:r>
         <w:br/>
         <w:t>/static/background.jpg</w:t>
@@ -977,8 +1603,13 @@
     </w:p>
     <w:p>
       <w:r>
-        <w:t>git init</w:t>
-      </w:r>
+        <w:t xml:space="preserve">git </w:t>
+      </w:r>
+      <w:proofErr w:type="spellStart"/>
+      <w:r>
+        <w:t>init</w:t>
+      </w:r>
+      <w:proofErr w:type="spellEnd"/>
       <w:r>
         <w:br/>
         <w:t xml:space="preserve">git </w:t>
@@ -1110,7 +1741,19 @@
           <w:rPr>
             <w:rStyle w:val="Hyperlink"/>
           </w:rPr>
-          <w:t>https://render.com</w:t>
+          <w:t>https://ren</w:t>
+        </w:r>
+        <w:r>
+          <w:rPr>
+            <w:rStyle w:val="Hyperlink"/>
+          </w:rPr>
+          <w:t>d</w:t>
+        </w:r>
+        <w:r>
+          <w:rPr>
+            <w:rStyle w:val="Hyperlink"/>
+          </w:rPr>
+          <w:t>er.com</w:t>
         </w:r>
       </w:hyperlink>
       <w:r>
@@ -1185,8 +1828,21 @@
       </w:r>
       <w:r>
         <w:br/>
-        <w:t>Start Command: gunicorn app:app</w:t>
-      </w:r>
+        <w:t xml:space="preserve">Start Command: </w:t>
+      </w:r>
+      <w:proofErr w:type="spellStart"/>
+      <w:r>
+        <w:t>gunicorn</w:t>
+      </w:r>
+      <w:proofErr w:type="spellEnd"/>
+      <w:r>
+        <w:t xml:space="preserve"> </w:t>
+      </w:r>
+      <w:proofErr w:type="spellStart"/>
+      <w:r>
+        <w:t>app:app</w:t>
+      </w:r>
+      <w:proofErr w:type="spellEnd"/>
     </w:p>
     <w:p>
       <w:pPr>
@@ -1269,8 +1925,13 @@
         <w:t>✅</w:t>
       </w:r>
       <w:r>
-        <w:t xml:space="preserve"> No ngrok</w:t>
-      </w:r>
+        <w:t xml:space="preserve"> No </w:t>
+      </w:r>
+      <w:proofErr w:type="spellStart"/>
+      <w:r>
+        <w:t>ngrok</w:t>
+      </w:r>
+      <w:proofErr w:type="spellEnd"/>
       <w:r>
         <w:br/>
       </w:r>
@@ -1533,8 +2194,29 @@
     </w:p>
     <w:p>
       <w:r>
-        <w:t>from flask import Flask, render_template, request, redirect, send_file, flash, session, url_for</w:t>
-      </w:r>
+        <w:t xml:space="preserve">from flask import Flask, </w:t>
+      </w:r>
+      <w:proofErr w:type="spellStart"/>
+      <w:r>
+        <w:t>render_template</w:t>
+      </w:r>
+      <w:proofErr w:type="spellEnd"/>
+      <w:r>
+        <w:t xml:space="preserve">, request, redirect, </w:t>
+      </w:r>
+      <w:proofErr w:type="spellStart"/>
+      <w:r>
+        <w:t>send_file</w:t>
+      </w:r>
+      <w:proofErr w:type="spellEnd"/>
+      <w:r>
+        <w:t xml:space="preserve">, flash, session, </w:t>
+      </w:r>
+      <w:proofErr w:type="spellStart"/>
+      <w:r>
+        <w:t>url_for</w:t>
+      </w:r>
+      <w:proofErr w:type="spellEnd"/>
       <w:r>
         <w:br/>
         <w:t>import sqlite3</w:t>
@@ -1545,18 +2227,36 @@
       </w:r>
       <w:r>
         <w:br/>
-        <w:t>from io import BytesIO</w:t>
-      </w:r>
-      <w:r>
-        <w:br/>
-        <w:t>import os</w:t>
-      </w:r>
-      <w:r>
-        <w:br/>
-      </w:r>
-      <w:r>
-        <w:br/>
-        <w:t>DB_NAME = "inventory.db"</w:t>
+        <w:t xml:space="preserve">from io import </w:t>
+      </w:r>
+      <w:proofErr w:type="spellStart"/>
+      <w:r>
+        <w:t>BytesIO</w:t>
+      </w:r>
+      <w:proofErr w:type="spellEnd"/>
+      <w:r>
+        <w:br/>
+        <w:t xml:space="preserve">import </w:t>
+      </w:r>
+      <w:proofErr w:type="spellStart"/>
+      <w:r>
+        <w:t>os</w:t>
+      </w:r>
+      <w:proofErr w:type="spellEnd"/>
+      <w:r>
+        <w:br/>
+      </w:r>
+      <w:r>
+        <w:br/>
+        <w:t>DB_NAME = "</w:t>
+      </w:r>
+      <w:proofErr w:type="spellStart"/>
+      <w:r>
+        <w:t>inventory.db</w:t>
+      </w:r>
+      <w:proofErr w:type="spellEnd"/>
+      <w:r>
+        <w:t>"</w:t>
       </w:r>
       <w:r>
         <w:br/>
@@ -1564,7 +2264,22 @@
       </w:r>
       <w:r>
         <w:br/>
-        <w:t>app.secret_key = os.environ.get("SECRET_KEY", "supersecret")  # for sessions &amp; flash</w:t>
+      </w:r>
+      <w:proofErr w:type="spellStart"/>
+      <w:r>
+        <w:t>app.secret_key</w:t>
+      </w:r>
+      <w:proofErr w:type="spellEnd"/>
+      <w:r>
+        <w:t xml:space="preserve"> = </w:t>
+      </w:r>
+      <w:proofErr w:type="spellStart"/>
+      <w:r>
+        <w:t>os.environ.get</w:t>
+      </w:r>
+      <w:proofErr w:type="spellEnd"/>
+      <w:r>
+        <w:t>("SECRET_KEY", "supersecret")  # for sessions &amp; flash</w:t>
       </w:r>
       <w:r>
         <w:br/>
@@ -1575,22 +2290,54 @@
       </w:r>
       <w:r>
         <w:br/>
-        <w:t>USERNAME = os.environ.get("APP_USER", "admin")</w:t>
-      </w:r>
-      <w:r>
-        <w:br/>
-        <w:t>PASSWORD = os.environ.get("APP_PASS", "password123")</w:t>
-      </w:r>
-      <w:r>
-        <w:br/>
-      </w:r>
-      <w:r>
-        <w:br/>
-        <w:t>def login_required(f):</w:t>
-      </w:r>
-      <w:r>
-        <w:br/>
-        <w:t xml:space="preserve">    from functools import wraps</w:t>
+        <w:t xml:space="preserve">USERNAME = </w:t>
+      </w:r>
+      <w:proofErr w:type="spellStart"/>
+      <w:r>
+        <w:t>os.environ.get</w:t>
+      </w:r>
+      <w:proofErr w:type="spellEnd"/>
+      <w:r>
+        <w:t>("APP_USER", "admin")</w:t>
+      </w:r>
+      <w:r>
+        <w:br/>
+        <w:t xml:space="preserve">PASSWORD = </w:t>
+      </w:r>
+      <w:proofErr w:type="spellStart"/>
+      <w:r>
+        <w:t>os.environ.get</w:t>
+      </w:r>
+      <w:proofErr w:type="spellEnd"/>
+      <w:r>
+        <w:t>("APP_PASS", "password123")</w:t>
+      </w:r>
+      <w:r>
+        <w:br/>
+      </w:r>
+      <w:r>
+        <w:br/>
+        <w:t xml:space="preserve">def </w:t>
+      </w:r>
+      <w:proofErr w:type="spellStart"/>
+      <w:r>
+        <w:t>login_required</w:t>
+      </w:r>
+      <w:proofErr w:type="spellEnd"/>
+      <w:r>
+        <w:t>(f):</w:t>
+      </w:r>
+      <w:r>
+        <w:br/>
+        <w:t xml:space="preserve">    from </w:t>
+      </w:r>
+      <w:proofErr w:type="spellStart"/>
+      <w:r>
+        <w:t>functools</w:t>
+      </w:r>
+      <w:proofErr w:type="spellEnd"/>
+      <w:r>
+        <w:t xml:space="preserve"> import wraps</w:t>
       </w:r>
       <w:r>
         <w:br/>
@@ -1598,27 +2345,96 @@
       </w:r>
       <w:r>
         <w:br/>
-        <w:t xml:space="preserve">    def decorated_function(*args, **kwargs):</w:t>
-      </w:r>
-      <w:r>
-        <w:br/>
-        <w:t xml:space="preserve">        if not session.get("logged_in"):</w:t>
+        <w:t xml:space="preserve">    def </w:t>
+      </w:r>
+      <w:proofErr w:type="spellStart"/>
+      <w:r>
+        <w:t>decorated_function</w:t>
+      </w:r>
+      <w:proofErr w:type="spellEnd"/>
+      <w:r>
+        <w:t>(*</w:t>
+      </w:r>
+      <w:proofErr w:type="spellStart"/>
+      <w:r>
+        <w:t>args</w:t>
+      </w:r>
+      <w:proofErr w:type="spellEnd"/>
+      <w:r>
+        <w:t>, **</w:t>
+      </w:r>
+      <w:proofErr w:type="spellStart"/>
+      <w:r>
+        <w:t>kwargs</w:t>
+      </w:r>
+      <w:proofErr w:type="spellEnd"/>
+      <w:r>
+        <w:t>):</w:t>
+      </w:r>
+      <w:r>
+        <w:br/>
+        <w:t xml:space="preserve">        if not </w:t>
+      </w:r>
+      <w:proofErr w:type="spellStart"/>
+      <w:r>
+        <w:t>session.get</w:t>
+      </w:r>
+      <w:proofErr w:type="spellEnd"/>
+      <w:r>
+        <w:t>("</w:t>
+      </w:r>
+      <w:proofErr w:type="spellStart"/>
+      <w:r>
+        <w:t>logged_in</w:t>
+      </w:r>
+      <w:proofErr w:type="spellEnd"/>
+      <w:r>
+        <w:t>"):</w:t>
       </w:r>
       <w:r>
         <w:br/>
       </w:r>
       <w:r>
         <w:lastRenderedPageBreak/>
-        <w:t xml:space="preserve">            return redirect(url_for("login"))</w:t>
-      </w:r>
-      <w:r>
-        <w:br/>
-        <w:t xml:space="preserve">        return f(*args, **kwargs)</w:t>
-      </w:r>
-      <w:r>
-        <w:br/>
-        <w:t xml:space="preserve">    return decorated_function</w:t>
-      </w:r>
+        <w:t xml:space="preserve">            return redirect(</w:t>
+      </w:r>
+      <w:proofErr w:type="spellStart"/>
+      <w:r>
+        <w:t>url_for</w:t>
+      </w:r>
+      <w:proofErr w:type="spellEnd"/>
+      <w:r>
+        <w:t>("login"))</w:t>
+      </w:r>
+      <w:r>
+        <w:br/>
+        <w:t xml:space="preserve">        return f(*</w:t>
+      </w:r>
+      <w:proofErr w:type="spellStart"/>
+      <w:r>
+        <w:t>args</w:t>
+      </w:r>
+      <w:proofErr w:type="spellEnd"/>
+      <w:r>
+        <w:t>, **</w:t>
+      </w:r>
+      <w:proofErr w:type="spellStart"/>
+      <w:r>
+        <w:t>kwargs</w:t>
+      </w:r>
+      <w:proofErr w:type="spellEnd"/>
+      <w:r>
+        <w:t>)</w:t>
+      </w:r>
+      <w:r>
+        <w:br/>
+        <w:t xml:space="preserve">    return </w:t>
+      </w:r>
+      <w:proofErr w:type="spellStart"/>
+      <w:r>
+        <w:t>decorated_function</w:t>
+      </w:r>
+      <w:proofErr w:type="spellEnd"/>
       <w:r>
         <w:br/>
       </w:r>
@@ -1628,7 +2444,15 @@
       </w:r>
       <w:r>
         <w:br/>
-        <w:t>def init_db():</w:t>
+        <w:t xml:space="preserve">def </w:t>
+      </w:r>
+      <w:proofErr w:type="spellStart"/>
+      <w:r>
+        <w:t>init_db</w:t>
+      </w:r>
+      <w:proofErr w:type="spellEnd"/>
+      <w:r>
+        <w:t>():</w:t>
       </w:r>
       <w:r>
         <w:br/>
@@ -1636,11 +2460,27 @@
       </w:r>
       <w:r>
         <w:br/>
-        <w:t xml:space="preserve">    cursor = conn.cursor()</w:t>
-      </w:r>
-      <w:r>
-        <w:br/>
-        <w:t xml:space="preserve">    cursor.execute("""</w:t>
+        <w:t xml:space="preserve">    cursor = </w:t>
+      </w:r>
+      <w:proofErr w:type="spellStart"/>
+      <w:r>
+        <w:t>conn.cursor</w:t>
+      </w:r>
+      <w:proofErr w:type="spellEnd"/>
+      <w:r>
+        <w:t>()</w:t>
+      </w:r>
+      <w:r>
+        <w:br/>
+        <w:t xml:space="preserve">    </w:t>
+      </w:r>
+      <w:proofErr w:type="spellStart"/>
+      <w:r>
+        <w:t>cursor.execute</w:t>
+      </w:r>
+      <w:proofErr w:type="spellEnd"/>
+      <w:r>
+        <w:t>("""</w:t>
       </w:r>
       <w:r>
         <w:br/>
@@ -1648,11 +2488,27 @@
       </w:r>
       <w:r>
         <w:br/>
-        <w:t xml:space="preserve">            product_no TEXT PRIMARY KEY,</w:t>
-      </w:r>
-      <w:r>
-        <w:br/>
-        <w:t xml:space="preserve">            item_name TEXT,</w:t>
+        <w:t xml:space="preserve">            </w:t>
+      </w:r>
+      <w:proofErr w:type="spellStart"/>
+      <w:r>
+        <w:t>product_no</w:t>
+      </w:r>
+      <w:proofErr w:type="spellEnd"/>
+      <w:r>
+        <w:t xml:space="preserve"> TEXT PRIMARY KEY,</w:t>
+      </w:r>
+      <w:r>
+        <w:br/>
+        <w:t xml:space="preserve">            </w:t>
+      </w:r>
+      <w:proofErr w:type="spellStart"/>
+      <w:r>
+        <w:t>item_name</w:t>
+      </w:r>
+      <w:proofErr w:type="spellEnd"/>
+      <w:r>
+        <w:t xml:space="preserve"> TEXT,</w:t>
       </w:r>
       <w:r>
         <w:br/>
@@ -1668,18 +2524,42 @@
       </w:r>
       <w:r>
         <w:br/>
-        <w:t xml:space="preserve">    conn.commit()</w:t>
-      </w:r>
-      <w:r>
-        <w:br/>
-        <w:t xml:space="preserve">    conn.close()</w:t>
-      </w:r>
-      <w:r>
-        <w:br/>
-      </w:r>
-      <w:r>
-        <w:br/>
-        <w:t>def run_query(query, params=()):</w:t>
+        <w:t xml:space="preserve">    </w:t>
+      </w:r>
+      <w:proofErr w:type="spellStart"/>
+      <w:r>
+        <w:t>conn.commit</w:t>
+      </w:r>
+      <w:proofErr w:type="spellEnd"/>
+      <w:r>
+        <w:t>()</w:t>
+      </w:r>
+      <w:r>
+        <w:br/>
+        <w:t xml:space="preserve">    </w:t>
+      </w:r>
+      <w:proofErr w:type="spellStart"/>
+      <w:r>
+        <w:t>conn.close</w:t>
+      </w:r>
+      <w:proofErr w:type="spellEnd"/>
+      <w:r>
+        <w:t>()</w:t>
+      </w:r>
+      <w:r>
+        <w:br/>
+      </w:r>
+      <w:r>
+        <w:br/>
+        <w:t xml:space="preserve">def </w:t>
+      </w:r>
+      <w:proofErr w:type="spellStart"/>
+      <w:r>
+        <w:t>run_query</w:t>
+      </w:r>
+      <w:proofErr w:type="spellEnd"/>
+      <w:r>
+        <w:t>(query, params=()):</w:t>
       </w:r>
       <w:r>
         <w:br/>
@@ -1687,23 +2567,63 @@
       </w:r>
       <w:r>
         <w:br/>
-        <w:t xml:space="preserve">    cursor = conn.cursor()</w:t>
-      </w:r>
-      <w:r>
-        <w:br/>
-        <w:t xml:space="preserve">    cursor.execute(query, params)</w:t>
-      </w:r>
-      <w:r>
-        <w:br/>
-        <w:t xml:space="preserve">    conn.commit()</w:t>
-      </w:r>
-      <w:r>
-        <w:br/>
-        <w:t xml:space="preserve">    data = cursor.fetchall()</w:t>
-      </w:r>
-      <w:r>
-        <w:br/>
-        <w:t xml:space="preserve">    conn.close()</w:t>
+        <w:t xml:space="preserve">    cursor = </w:t>
+      </w:r>
+      <w:proofErr w:type="spellStart"/>
+      <w:r>
+        <w:t>conn.cursor</w:t>
+      </w:r>
+      <w:proofErr w:type="spellEnd"/>
+      <w:r>
+        <w:t>()</w:t>
+      </w:r>
+      <w:r>
+        <w:br/>
+        <w:t xml:space="preserve">    </w:t>
+      </w:r>
+      <w:proofErr w:type="spellStart"/>
+      <w:r>
+        <w:t>cursor.execute</w:t>
+      </w:r>
+      <w:proofErr w:type="spellEnd"/>
+      <w:r>
+        <w:t>(query, params)</w:t>
+      </w:r>
+      <w:r>
+        <w:br/>
+        <w:t xml:space="preserve">    </w:t>
+      </w:r>
+      <w:proofErr w:type="spellStart"/>
+      <w:r>
+        <w:t>conn.commit</w:t>
+      </w:r>
+      <w:proofErr w:type="spellEnd"/>
+      <w:r>
+        <w:t>()</w:t>
+      </w:r>
+      <w:r>
+        <w:br/>
+        <w:t xml:space="preserve">    data = </w:t>
+      </w:r>
+      <w:proofErr w:type="spellStart"/>
+      <w:r>
+        <w:t>cursor.fetchall</w:t>
+      </w:r>
+      <w:proofErr w:type="spellEnd"/>
+      <w:r>
+        <w:t>()</w:t>
+      </w:r>
+      <w:r>
+        <w:br/>
+        <w:t xml:space="preserve">    </w:t>
+      </w:r>
+      <w:proofErr w:type="spellStart"/>
+      <w:r>
+        <w:t>conn.close</w:t>
+      </w:r>
+      <w:proofErr w:type="spellEnd"/>
+      <w:r>
+        <w:t>()</w:t>
       </w:r>
       <w:r>
         <w:br/>
@@ -1726,23 +2646,71 @@
       </w:r>
       <w:r>
         <w:br/>
-        <w:t xml:space="preserve">    if request.method == "POST":</w:t>
-      </w:r>
-      <w:r>
-        <w:br/>
-        <w:t xml:space="preserve">        user = request.form.get("username")</w:t>
-      </w:r>
-      <w:r>
-        <w:br/>
-        <w:t xml:space="preserve">        pwd = request.form.get("password")</w:t>
-      </w:r>
-      <w:r>
-        <w:br/>
-        <w:t xml:space="preserve">        if user == USERNAME and pwd == PASSWORD:</w:t>
-      </w:r>
-      <w:r>
-        <w:br/>
-        <w:t xml:space="preserve">            session["logged_in"] = True</w:t>
+        <w:t xml:space="preserve">    if </w:t>
+      </w:r>
+      <w:proofErr w:type="spellStart"/>
+      <w:r>
+        <w:t>request.method</w:t>
+      </w:r>
+      <w:proofErr w:type="spellEnd"/>
+      <w:r>
+        <w:t xml:space="preserve"> == "POST":</w:t>
+      </w:r>
+      <w:r>
+        <w:br/>
+        <w:t xml:space="preserve">        user = </w:t>
+      </w:r>
+      <w:proofErr w:type="spellStart"/>
+      <w:r>
+        <w:t>request.form.get</w:t>
+      </w:r>
+      <w:proofErr w:type="spellEnd"/>
+      <w:r>
+        <w:t>("username")</w:t>
+      </w:r>
+      <w:r>
+        <w:br/>
+        <w:t xml:space="preserve">        </w:t>
+      </w:r>
+      <w:proofErr w:type="spellStart"/>
+      <w:r>
+        <w:t>pwd</w:t>
+      </w:r>
+      <w:proofErr w:type="spellEnd"/>
+      <w:r>
+        <w:t xml:space="preserve"> = </w:t>
+      </w:r>
+      <w:proofErr w:type="spellStart"/>
+      <w:r>
+        <w:t>request.form.get</w:t>
+      </w:r>
+      <w:proofErr w:type="spellEnd"/>
+      <w:r>
+        <w:t>("password")</w:t>
+      </w:r>
+      <w:r>
+        <w:br/>
+        <w:t xml:space="preserve">        if user == USERNAME and </w:t>
+      </w:r>
+      <w:proofErr w:type="spellStart"/>
+      <w:r>
+        <w:t>pwd</w:t>
+      </w:r>
+      <w:proofErr w:type="spellEnd"/>
+      <w:r>
+        <w:t xml:space="preserve"> == PASSWORD:</w:t>
+      </w:r>
+      <w:r>
+        <w:br/>
+        <w:t xml:space="preserve">            session["</w:t>
+      </w:r>
+      <w:proofErr w:type="spellStart"/>
+      <w:r>
+        <w:t>logged_in</w:t>
+      </w:r>
+      <w:proofErr w:type="spellEnd"/>
+      <w:r>
+        <w:t>"] = True</w:t>
       </w:r>
       <w:r>
         <w:br/>
@@ -1769,7 +2737,15 @@
       </w:r>
       <w:r>
         <w:br/>
-        <w:t xml:space="preserve">    return render_template("login.html")</w:t>
+        <w:t xml:space="preserve">    return </w:t>
+      </w:r>
+      <w:proofErr w:type="spellStart"/>
+      <w:r>
+        <w:t>render_template</w:t>
+      </w:r>
+      <w:proofErr w:type="spellEnd"/>
+      <w:r>
+        <w:t>("login.html")</w:t>
       </w:r>
       <w:r>
         <w:br/>
@@ -1788,7 +2764,15 @@
       </w:r>
       <w:r>
         <w:br/>
-        <w:t xml:space="preserve">    session.clear()</w:t>
+        <w:t xml:space="preserve">    </w:t>
+      </w:r>
+      <w:proofErr w:type="spellStart"/>
+      <w:r>
+        <w:t>session.clear</w:t>
+      </w:r>
+      <w:proofErr w:type="spellEnd"/>
+      <w:r>
+        <w:t>()</w:t>
       </w:r>
       <w:r>
         <w:br/>
@@ -1815,19 +2799,51 @@
       </w:r>
       <w:r>
         <w:br/>
-        <w:t xml:space="preserve">    if request.method == "POST":</w:t>
-      </w:r>
-      <w:r>
-        <w:br/>
-        <w:t xml:space="preserve">        product = request.form.get("product").strip()</w:t>
-      </w:r>
-      <w:r>
-        <w:br/>
-        <w:t xml:space="preserve">        name = request.form.get("name").strip()</w:t>
-      </w:r>
-      <w:r>
-        <w:br/>
-        <w:t xml:space="preserve">        qty = request.form.get("quantity").strip()</w:t>
+        <w:t xml:space="preserve">    if </w:t>
+      </w:r>
+      <w:proofErr w:type="spellStart"/>
+      <w:r>
+        <w:t>request.method</w:t>
+      </w:r>
+      <w:proofErr w:type="spellEnd"/>
+      <w:r>
+        <w:t xml:space="preserve"> == "POST":</w:t>
+      </w:r>
+      <w:r>
+        <w:br/>
+        <w:t xml:space="preserve">        product = </w:t>
+      </w:r>
+      <w:proofErr w:type="spellStart"/>
+      <w:r>
+        <w:t>request.form.get</w:t>
+      </w:r>
+      <w:proofErr w:type="spellEnd"/>
+      <w:r>
+        <w:t>("product").strip()</w:t>
+      </w:r>
+      <w:r>
+        <w:br/>
+        <w:t xml:space="preserve">        name = </w:t>
+      </w:r>
+      <w:proofErr w:type="spellStart"/>
+      <w:r>
+        <w:t>request.form.get</w:t>
+      </w:r>
+      <w:proofErr w:type="spellEnd"/>
+      <w:r>
+        <w:t>("name").strip()</w:t>
+      </w:r>
+      <w:r>
+        <w:br/>
+        <w:t xml:space="preserve">        qty = </w:t>
+      </w:r>
+      <w:proofErr w:type="spellStart"/>
+      <w:r>
+        <w:t>request.form.get</w:t>
+      </w:r>
+      <w:proofErr w:type="spellEnd"/>
+      <w:r>
+        <w:t>("quantity").strip()</w:t>
       </w:r>
       <w:r>
         <w:br/>
@@ -1839,7 +2855,15 @@
       </w:r>
       <w:r>
         <w:br/>
-        <w:t xml:space="preserve">            run_query("INSERT INTO inventory VALUES (?, ?, ?)", (product, name, qty))</w:t>
+        <w:t xml:space="preserve">            </w:t>
+      </w:r>
+      <w:proofErr w:type="spellStart"/>
+      <w:r>
+        <w:t>run_query</w:t>
+      </w:r>
+      <w:proofErr w:type="spellEnd"/>
+      <w:r>
+        <w:t>("INSERT INTO inventory VALUES (?, ?, ?)", (product, name, qty))</w:t>
       </w:r>
       <w:r>
         <w:br/>
@@ -1862,11 +2886,27 @@
       </w:r>
       <w:r>
         <w:br/>
-        <w:t xml:space="preserve">    items = run_query("SELECT * FROM inventory")</w:t>
-      </w:r>
-      <w:r>
-        <w:br/>
-        <w:t xml:space="preserve">    return render_template("index.html", items=items)</w:t>
+        <w:t xml:space="preserve">    items = </w:t>
+      </w:r>
+      <w:proofErr w:type="spellStart"/>
+      <w:r>
+        <w:t>run_query</w:t>
+      </w:r>
+      <w:proofErr w:type="spellEnd"/>
+      <w:r>
+        <w:t>("SELECT * FROM inventory")</w:t>
+      </w:r>
+      <w:r>
+        <w:br/>
+        <w:t xml:space="preserve">    return </w:t>
+      </w:r>
+      <w:proofErr w:type="spellStart"/>
+      <w:r>
+        <w:t>render_template</w:t>
+      </w:r>
+      <w:proofErr w:type="spellEnd"/>
+      <w:r>
+        <w:t>("index.html", items=items)</w:t>
       </w:r>
       <w:r>
         <w:br/>
@@ -1881,11 +2921,43 @@
       </w:r>
       <w:r>
         <w:br/>
-        <w:t>def delete(product_no):</w:t>
-      </w:r>
-      <w:r>
-        <w:br/>
-        <w:t xml:space="preserve">    run_query("DELETE FROM inventory WHERE product_no=?", (product_no,))</w:t>
+        <w:t>def delete(</w:t>
+      </w:r>
+      <w:proofErr w:type="spellStart"/>
+      <w:r>
+        <w:t>product_no</w:t>
+      </w:r>
+      <w:proofErr w:type="spellEnd"/>
+      <w:r>
+        <w:t>):</w:t>
+      </w:r>
+      <w:r>
+        <w:br/>
+        <w:t xml:space="preserve">    </w:t>
+      </w:r>
+      <w:proofErr w:type="spellStart"/>
+      <w:r>
+        <w:t>run_query</w:t>
+      </w:r>
+      <w:proofErr w:type="spellEnd"/>
+      <w:r>
+        <w:t xml:space="preserve">("DELETE FROM inventory WHERE </w:t>
+      </w:r>
+      <w:proofErr w:type="spellStart"/>
+      <w:r>
+        <w:t>product_no</w:t>
+      </w:r>
+      <w:proofErr w:type="spellEnd"/>
+      <w:r>
+        <w:t>=?", (</w:t>
+      </w:r>
+      <w:proofErr w:type="spellStart"/>
+      <w:r>
+        <w:t>product_no</w:t>
+      </w:r>
+      <w:proofErr w:type="spellEnd"/>
+      <w:r>
+        <w:t>,))</w:t>
       </w:r>
       <w:r>
         <w:br/>
@@ -1911,15 +2983,39 @@
       </w:r>
       <w:r>
         <w:lastRenderedPageBreak/>
-        <w:t>def edit(product_no):</w:t>
-      </w:r>
-      <w:r>
-        <w:br/>
-        <w:t xml:space="preserve">    if request.method == "POST":</w:t>
-      </w:r>
-      <w:r>
-        <w:br/>
-        <w:t xml:space="preserve">        qty = request.form.get("quantity")</w:t>
+        <w:t>def edit(</w:t>
+      </w:r>
+      <w:proofErr w:type="spellStart"/>
+      <w:r>
+        <w:t>product_no</w:t>
+      </w:r>
+      <w:proofErr w:type="spellEnd"/>
+      <w:r>
+        <w:t>):</w:t>
+      </w:r>
+      <w:r>
+        <w:br/>
+        <w:t xml:space="preserve">    if </w:t>
+      </w:r>
+      <w:proofErr w:type="spellStart"/>
+      <w:r>
+        <w:t>request.method</w:t>
+      </w:r>
+      <w:proofErr w:type="spellEnd"/>
+      <w:r>
+        <w:t xml:space="preserve"> == "POST":</w:t>
+      </w:r>
+      <w:r>
+        <w:br/>
+        <w:t xml:space="preserve">        qty = </w:t>
+      </w:r>
+      <w:proofErr w:type="spellStart"/>
+      <w:r>
+        <w:t>request.form.get</w:t>
+      </w:r>
+      <w:proofErr w:type="spellEnd"/>
+      <w:r>
+        <w:t>("quantity")</w:t>
       </w:r>
       <w:r>
         <w:br/>
@@ -1931,7 +3027,31 @@
       </w:r>
       <w:r>
         <w:br/>
-        <w:t xml:space="preserve">            run_query("UPDATE inventory SET quantity=? WHERE product_no=?", (qty, product_no))</w:t>
+        <w:t xml:space="preserve">            </w:t>
+      </w:r>
+      <w:proofErr w:type="spellStart"/>
+      <w:r>
+        <w:t>run_query</w:t>
+      </w:r>
+      <w:proofErr w:type="spellEnd"/>
+      <w:r>
+        <w:t xml:space="preserve">("UPDATE inventory SET quantity=? WHERE </w:t>
+      </w:r>
+      <w:proofErr w:type="spellStart"/>
+      <w:r>
+        <w:t>product_no</w:t>
+      </w:r>
+      <w:proofErr w:type="spellEnd"/>
+      <w:r>
+        <w:t xml:space="preserve">=?", (qty, </w:t>
+      </w:r>
+      <w:proofErr w:type="spellStart"/>
+      <w:r>
+        <w:t>product_no</w:t>
+      </w:r>
+      <w:proofErr w:type="spellEnd"/>
+      <w:r>
+        <w:t>))</w:t>
       </w:r>
       <w:r>
         <w:br/>
@@ -1954,11 +3074,43 @@
       </w:r>
       <w:r>
         <w:br/>
-        <w:t xml:space="preserve">    item = run_query("SELECT * FROM inventory WHERE product_no=?", (product_no,))</w:t>
-      </w:r>
-      <w:r>
-        <w:br/>
-        <w:t xml:space="preserve">    return render_template("edit.html", item=item[0])</w:t>
+        <w:t xml:space="preserve">    item = </w:t>
+      </w:r>
+      <w:proofErr w:type="spellStart"/>
+      <w:r>
+        <w:t>run_query</w:t>
+      </w:r>
+      <w:proofErr w:type="spellEnd"/>
+      <w:r>
+        <w:t xml:space="preserve">("SELECT * FROM inventory WHERE </w:t>
+      </w:r>
+      <w:proofErr w:type="spellStart"/>
+      <w:r>
+        <w:t>product_no</w:t>
+      </w:r>
+      <w:proofErr w:type="spellEnd"/>
+      <w:r>
+        <w:t>=?", (</w:t>
+      </w:r>
+      <w:proofErr w:type="spellStart"/>
+      <w:r>
+        <w:t>product_no</w:t>
+      </w:r>
+      <w:proofErr w:type="spellEnd"/>
+      <w:r>
+        <w:t>,))</w:t>
+      </w:r>
+      <w:r>
+        <w:br/>
+        <w:t xml:space="preserve">    return </w:t>
+      </w:r>
+      <w:proofErr w:type="spellStart"/>
+      <w:r>
+        <w:t>render_template</w:t>
+      </w:r>
+      <w:proofErr w:type="spellEnd"/>
+      <w:r>
+        <w:t>("edit.html", item=item[0])</w:t>
       </w:r>
       <w:r>
         <w:br/>
@@ -1977,7 +3129,15 @@
       </w:r>
       <w:r>
         <w:br/>
-        <w:t xml:space="preserve">    file = request.files.get("file")</w:t>
+        <w:t xml:space="preserve">    file = </w:t>
+      </w:r>
+      <w:proofErr w:type="spellStart"/>
+      <w:r>
+        <w:t>request.files.get</w:t>
+      </w:r>
+      <w:proofErr w:type="spellEnd"/>
+      <w:r>
+        <w:t>("file")</w:t>
       </w:r>
       <w:r>
         <w:br/>
@@ -1996,41 +3156,121 @@
       </w:r>
       <w:r>
         <w:br/>
-        <w:t xml:space="preserve">    df = pd.read_excel(file)</w:t>
-      </w:r>
-      <w:r>
-        <w:br/>
-        <w:t xml:space="preserve">    existing = set(x[0] for x in run_query("SELECT product_no FROM inventory"))</w:t>
-      </w:r>
-      <w:r>
-        <w:br/>
-        <w:t xml:space="preserve">    new_count = 0</w:t>
-      </w:r>
-      <w:r>
-        <w:br/>
-        <w:t xml:space="preserve">    duplicate_count = 0</w:t>
-      </w:r>
-      <w:r>
-        <w:br/>
-      </w:r>
-      <w:r>
-        <w:br/>
-        <w:t xml:space="preserve">    for _, row in df.iterrows():</w:t>
-      </w:r>
-      <w:r>
-        <w:br/>
-        <w:t xml:space="preserve">        product = str(row.iloc[0]).strip()</w:t>
-      </w:r>
-      <w:r>
-        <w:br/>
-        <w:t xml:space="preserve">        name = str(row.iloc[1]).strip()</w:t>
-      </w:r>
-      <w:r>
-        <w:br/>
-      </w:r>
-      <w:r>
-        <w:br/>
-        <w:t xml:space="preserve">        if not product or product.lower() == "nan":</w:t>
+        <w:t xml:space="preserve">    </w:t>
+      </w:r>
+      <w:proofErr w:type="spellStart"/>
+      <w:r>
+        <w:t>df</w:t>
+      </w:r>
+      <w:proofErr w:type="spellEnd"/>
+      <w:r>
+        <w:t xml:space="preserve"> = </w:t>
+      </w:r>
+      <w:proofErr w:type="spellStart"/>
+      <w:r>
+        <w:t>pd.read_excel</w:t>
+      </w:r>
+      <w:proofErr w:type="spellEnd"/>
+      <w:r>
+        <w:t>(file)</w:t>
+      </w:r>
+      <w:r>
+        <w:br/>
+        <w:t xml:space="preserve">    existing = set(x[0] for x in </w:t>
+      </w:r>
+      <w:proofErr w:type="spellStart"/>
+      <w:r>
+        <w:t>run_query</w:t>
+      </w:r>
+      <w:proofErr w:type="spellEnd"/>
+      <w:r>
+        <w:t xml:space="preserve">("SELECT </w:t>
+      </w:r>
+      <w:proofErr w:type="spellStart"/>
+      <w:r>
+        <w:t>product_no</w:t>
+      </w:r>
+      <w:proofErr w:type="spellEnd"/>
+      <w:r>
+        <w:t xml:space="preserve"> FROM inventory"))</w:t>
+      </w:r>
+      <w:r>
+        <w:br/>
+        <w:t xml:space="preserve">    </w:t>
+      </w:r>
+      <w:proofErr w:type="spellStart"/>
+      <w:r>
+        <w:t>new_count</w:t>
+      </w:r>
+      <w:proofErr w:type="spellEnd"/>
+      <w:r>
+        <w:t xml:space="preserve"> = 0</w:t>
+      </w:r>
+      <w:r>
+        <w:br/>
+        <w:t xml:space="preserve">    </w:t>
+      </w:r>
+      <w:proofErr w:type="spellStart"/>
+      <w:r>
+        <w:t>duplicate_count</w:t>
+      </w:r>
+      <w:proofErr w:type="spellEnd"/>
+      <w:r>
+        <w:t xml:space="preserve"> = 0</w:t>
+      </w:r>
+      <w:r>
+        <w:br/>
+      </w:r>
+      <w:r>
+        <w:br/>
+        <w:t xml:space="preserve">    for _, row in </w:t>
+      </w:r>
+      <w:proofErr w:type="spellStart"/>
+      <w:r>
+        <w:t>df.iterrows</w:t>
+      </w:r>
+      <w:proofErr w:type="spellEnd"/>
+      <w:r>
+        <w:t>():</w:t>
+      </w:r>
+      <w:r>
+        <w:br/>
+        <w:t xml:space="preserve">        product = str(</w:t>
+      </w:r>
+      <w:proofErr w:type="spellStart"/>
+      <w:r>
+        <w:t>row.iloc</w:t>
+      </w:r>
+      <w:proofErr w:type="spellEnd"/>
+      <w:r>
+        <w:t>[0]).strip()</w:t>
+      </w:r>
+      <w:r>
+        <w:br/>
+        <w:t xml:space="preserve">        name = str(</w:t>
+      </w:r>
+      <w:proofErr w:type="spellStart"/>
+      <w:r>
+        <w:t>row.iloc</w:t>
+      </w:r>
+      <w:proofErr w:type="spellEnd"/>
+      <w:r>
+        <w:t>[1]).strip()</w:t>
+      </w:r>
+      <w:r>
+        <w:br/>
+      </w:r>
+      <w:r>
+        <w:br/>
+        <w:t xml:space="preserve">        if not product or </w:t>
+      </w:r>
+      <w:proofErr w:type="spellStart"/>
+      <w:r>
+        <w:t>product.lower</w:t>
+      </w:r>
+      <w:proofErr w:type="spellEnd"/>
+      <w:r>
+        <w:t>() == "nan":</w:t>
       </w:r>
       <w:r>
         <w:br/>
@@ -2045,7 +3285,15 @@
       </w:r>
       <w:r>
         <w:br/>
-        <w:t xml:space="preserve">            duplicate_count += 1</w:t>
+        <w:t xml:space="preserve">            </w:t>
+      </w:r>
+      <w:proofErr w:type="spellStart"/>
+      <w:r>
+        <w:t>duplicate_count</w:t>
+      </w:r>
+      <w:proofErr w:type="spellEnd"/>
+      <w:r>
+        <w:t xml:space="preserve"> += 1</w:t>
       </w:r>
       <w:r>
         <w:br/>
@@ -2057,22 +3305,70 @@
       <w:r>
         <w:lastRenderedPageBreak/>
         <w:br/>
-        <w:t xml:space="preserve">        run_query("INSERT INTO inventory VALUES (?, ?, ?)", (product, name, None))</w:t>
-      </w:r>
-      <w:r>
-        <w:br/>
-        <w:t xml:space="preserve">        existing.add(product)</w:t>
-      </w:r>
-      <w:r>
-        <w:br/>
-        <w:t xml:space="preserve">        new_count += 1</w:t>
-      </w:r>
-      <w:r>
-        <w:br/>
-      </w:r>
-      <w:r>
-        <w:br/>
-        <w:t xml:space="preserve">    flash(f"Upload Summary: New: {new_count}, Duplicates: {duplicate_count}", "info")</w:t>
+        <w:t xml:space="preserve">        </w:t>
+      </w:r>
+      <w:proofErr w:type="spellStart"/>
+      <w:r>
+        <w:t>run_query</w:t>
+      </w:r>
+      <w:proofErr w:type="spellEnd"/>
+      <w:r>
+        <w:t>("INSERT INTO inventory VALUES (?, ?, ?)", (product, name, None))</w:t>
+      </w:r>
+      <w:r>
+        <w:br/>
+        <w:t xml:space="preserve">        </w:t>
+      </w:r>
+      <w:proofErr w:type="spellStart"/>
+      <w:r>
+        <w:t>existing.add</w:t>
+      </w:r>
+      <w:proofErr w:type="spellEnd"/>
+      <w:r>
+        <w:t>(product)</w:t>
+      </w:r>
+      <w:r>
+        <w:br/>
+        <w:t xml:space="preserve">        </w:t>
+      </w:r>
+      <w:proofErr w:type="spellStart"/>
+      <w:r>
+        <w:t>new_count</w:t>
+      </w:r>
+      <w:proofErr w:type="spellEnd"/>
+      <w:r>
+        <w:t xml:space="preserve"> += 1</w:t>
+      </w:r>
+      <w:r>
+        <w:br/>
+      </w:r>
+      <w:r>
+        <w:br/>
+        <w:t xml:space="preserve">    flash(</w:t>
+      </w:r>
+      <w:proofErr w:type="spellStart"/>
+      <w:r>
+        <w:t>f"Upload</w:t>
+      </w:r>
+      <w:proofErr w:type="spellEnd"/>
+      <w:r>
+        <w:t xml:space="preserve"> Summary: New: {</w:t>
+      </w:r>
+      <w:proofErr w:type="spellStart"/>
+      <w:r>
+        <w:t>new_count</w:t>
+      </w:r>
+      <w:proofErr w:type="spellEnd"/>
+      <w:r>
+        <w:t>}, Duplicates: {</w:t>
+      </w:r>
+      <w:proofErr w:type="spellStart"/>
+      <w:r>
+        <w:t>duplicate_count</w:t>
+      </w:r>
+      <w:proofErr w:type="spellEnd"/>
+      <w:r>
+        <w:t>}", "info")</w:t>
       </w:r>
       <w:r>
         <w:br/>
@@ -2095,33 +3391,105 @@
       </w:r>
       <w:r>
         <w:br/>
-        <w:t xml:space="preserve">    data = run_query("SELECT * FROM inventory")</w:t>
-      </w:r>
-      <w:r>
-        <w:br/>
-        <w:t xml:space="preserve">    df = pd.DataFrame(data, columns=["Product#", "Item Name", "Quantity"])</w:t>
-      </w:r>
-      <w:r>
-        <w:br/>
-      </w:r>
-      <w:r>
-        <w:br/>
-        <w:t xml:space="preserve">    output = BytesIO()</w:t>
-      </w:r>
-      <w:r>
-        <w:br/>
-        <w:t xml:space="preserve">    df.to_excel(output, index=False)</w:t>
-      </w:r>
-      <w:r>
-        <w:br/>
-        <w:t xml:space="preserve">    output.seek(0)</w:t>
-      </w:r>
-      <w:r>
-        <w:br/>
-      </w:r>
-      <w:r>
-        <w:br/>
-        <w:t xml:space="preserve">    return send_file(output, download_name="inventory.xlsx", as_attachment=True)</w:t>
+        <w:t xml:space="preserve">    data = </w:t>
+      </w:r>
+      <w:proofErr w:type="spellStart"/>
+      <w:r>
+        <w:t>run_query</w:t>
+      </w:r>
+      <w:proofErr w:type="spellEnd"/>
+      <w:r>
+        <w:t>("SELECT * FROM inventory")</w:t>
+      </w:r>
+      <w:r>
+        <w:br/>
+        <w:t xml:space="preserve">    </w:t>
+      </w:r>
+      <w:proofErr w:type="spellStart"/>
+      <w:r>
+        <w:t>df</w:t>
+      </w:r>
+      <w:proofErr w:type="spellEnd"/>
+      <w:r>
+        <w:t xml:space="preserve"> = </w:t>
+      </w:r>
+      <w:proofErr w:type="spellStart"/>
+      <w:r>
+        <w:t>pd.DataFrame</w:t>
+      </w:r>
+      <w:proofErr w:type="spellEnd"/>
+      <w:r>
+        <w:t>(data, columns=["Product#", "Item Name", "Quantity"])</w:t>
+      </w:r>
+      <w:r>
+        <w:br/>
+      </w:r>
+      <w:r>
+        <w:br/>
+        <w:t xml:space="preserve">    output = </w:t>
+      </w:r>
+      <w:proofErr w:type="spellStart"/>
+      <w:r>
+        <w:t>BytesIO</w:t>
+      </w:r>
+      <w:proofErr w:type="spellEnd"/>
+      <w:r>
+        <w:t>()</w:t>
+      </w:r>
+      <w:r>
+        <w:br/>
+        <w:t xml:space="preserve">    </w:t>
+      </w:r>
+      <w:proofErr w:type="spellStart"/>
+      <w:r>
+        <w:t>df.to_excel</w:t>
+      </w:r>
+      <w:proofErr w:type="spellEnd"/>
+      <w:r>
+        <w:t>(output, index=False)</w:t>
+      </w:r>
+      <w:r>
+        <w:br/>
+        <w:t xml:space="preserve">    </w:t>
+      </w:r>
+      <w:proofErr w:type="spellStart"/>
+      <w:r>
+        <w:t>output.seek</w:t>
+      </w:r>
+      <w:proofErr w:type="spellEnd"/>
+      <w:r>
+        <w:t>(0)</w:t>
+      </w:r>
+      <w:r>
+        <w:br/>
+      </w:r>
+      <w:r>
+        <w:br/>
+        <w:t xml:space="preserve">    return </w:t>
+      </w:r>
+      <w:proofErr w:type="spellStart"/>
+      <w:r>
+        <w:t>send_file</w:t>
+      </w:r>
+      <w:proofErr w:type="spellEnd"/>
+      <w:r>
+        <w:t xml:space="preserve">(output, </w:t>
+      </w:r>
+      <w:proofErr w:type="spellStart"/>
+      <w:r>
+        <w:t>download_name</w:t>
+      </w:r>
+      <w:proofErr w:type="spellEnd"/>
+      <w:r>
+        <w:t xml:space="preserve">="inventory.xlsx", </w:t>
+      </w:r>
+      <w:proofErr w:type="spellStart"/>
+      <w:r>
+        <w:t>as_attachment</w:t>
+      </w:r>
+      <w:proofErr w:type="spellEnd"/>
+      <w:r>
+        <w:t>=True)</w:t>
       </w:r>
       <w:r>
         <w:br/>
@@ -2136,21 +3504,45 @@
       </w:r>
       <w:r>
         <w:br/>
-        <w:t xml:space="preserve">    init_db()</w:t>
-      </w:r>
-      <w:r>
-        <w:br/>
-        <w:t xml:space="preserve">    port = int(os.environ.get("PORT", 10000))</w:t>
-      </w:r>
-      <w:r>
-        <w:br/>
-        <w:t xml:space="preserve">    app.run(host="0.0.0.0", port=port)</w:t>
+        <w:t xml:space="preserve">    </w:t>
+      </w:r>
+      <w:proofErr w:type="spellStart"/>
+      <w:r>
+        <w:t>init_db</w:t>
+      </w:r>
+      <w:proofErr w:type="spellEnd"/>
+      <w:r>
+        <w:t>()</w:t>
+      </w:r>
+      <w:r>
+        <w:br/>
+        <w:t xml:space="preserve">    port = int(</w:t>
+      </w:r>
+      <w:proofErr w:type="spellStart"/>
+      <w:r>
+        <w:t>os.environ.get</w:t>
+      </w:r>
+      <w:proofErr w:type="spellEnd"/>
+      <w:r>
+        <w:t>("PORT", 10000))</w:t>
+      </w:r>
+      <w:r>
+        <w:br/>
+        <w:t xml:space="preserve">    </w:t>
+      </w:r>
+      <w:proofErr w:type="spellStart"/>
+      <w:r>
+        <w:t>app.run</w:t>
+      </w:r>
+      <w:proofErr w:type="spellEnd"/>
+      <w:r>
+        <w:t>(host="0.0.0.0", port=port)</w:t>
       </w:r>
     </w:p>
     <w:p>
       <w:r>
         <w:pict w14:anchorId="13160600">
-          <v:rect id="_x0000_i1133" style="width:0;height:1.5pt" o:hralign="center" o:hrstd="t" o:hr="t" fillcolor="#a0a0a0" stroked="f"/>
+          <v:rect id="_x0000_i1037" style="width:0;height:1.5pt" o:hralign="center" o:hrstd="t" o:hr="t" fillcolor="#a0a0a0" stroked="f"/>
         </w:pict>
       </w:r>
     </w:p>
@@ -2205,7 +3597,15 @@
       </w:r>
       <w:r>
         <w:br/>
-        <w:t>&lt;html lang="en"&gt;</w:t>
+        <w:t>&lt;html lang="</w:t>
+      </w:r>
+      <w:proofErr w:type="spellStart"/>
+      <w:r>
+        <w:t>en</w:t>
+      </w:r>
+      <w:proofErr w:type="spellEnd"/>
+      <w:r>
+        <w:t>"&gt;</w:t>
       </w:r>
       <w:r>
         <w:br/>
@@ -2228,7 +3628,15 @@
       </w:r>
       <w:r>
         <w:br/>
-        <w:t xml:space="preserve">    &lt;link href="https://cdn.jsdelivr.net/npm/bootstrap@5.3.1/dist/css/bootstrap.min.css" rel="stylesheet"&gt;</w:t>
+        <w:t xml:space="preserve">    &lt;link href="https://cdn.jsdelivr.net/npm/bootstrap@5.3.1/dist/css/bootstrap.min.css" </w:t>
+      </w:r>
+      <w:proofErr w:type="spellStart"/>
+      <w:r>
+        <w:t>rel</w:t>
+      </w:r>
+      <w:proofErr w:type="spellEnd"/>
+      <w:r>
+        <w:t>="stylesheet"&gt;</w:t>
       </w:r>
       <w:r>
         <w:br/>
@@ -2240,7 +3648,23 @@
       </w:r>
       <w:r>
         <w:br/>
-        <w:t xml:space="preserve">            background: url('/static/background.jpg') no-repeat center center fixed;</w:t>
+        <w:t xml:space="preserve">            background: </w:t>
+      </w:r>
+      <w:proofErr w:type="spellStart"/>
+      <w:r>
+        <w:t>url</w:t>
+      </w:r>
+      <w:proofErr w:type="spellEnd"/>
+      <w:r>
+        <w:t xml:space="preserve">('/static/background.jpg') no-repeat center </w:t>
+      </w:r>
+      <w:proofErr w:type="spellStart"/>
+      <w:r>
+        <w:t>center</w:t>
+      </w:r>
+      <w:proofErr w:type="spellEnd"/>
+      <w:r>
+        <w:t xml:space="preserve"> fixed;</w:t>
       </w:r>
       <w:r>
         <w:br/>
@@ -2260,7 +3684,15 @@
       </w:r>
       <w:r>
         <w:br/>
-        <w:t xml:space="preserve">            background: rgba(0,0,0,0.6);</w:t>
+        <w:t xml:space="preserve">            background: </w:t>
+      </w:r>
+      <w:proofErr w:type="spellStart"/>
+      <w:r>
+        <w:t>rgba</w:t>
+      </w:r>
+      <w:proofErr w:type="spellEnd"/>
+      <w:r>
+        <w:t>(0,0,0,0.6);</w:t>
       </w:r>
       <w:r>
         <w:br/>
@@ -2304,7 +3736,23 @@
       </w:r>
       <w:r>
         <w:br/>
-        <w:t xml:space="preserve">    {% with messages = get_flashed_messages(with_categories=true) %}</w:t>
+        <w:t xml:space="preserve">    {% with messages = </w:t>
+      </w:r>
+      <w:proofErr w:type="spellStart"/>
+      <w:r>
+        <w:t>get_flashed_messages</w:t>
+      </w:r>
+      <w:proofErr w:type="spellEnd"/>
+      <w:r>
+        <w:t>(</w:t>
+      </w:r>
+      <w:proofErr w:type="spellStart"/>
+      <w:r>
+        <w:t>with_categories</w:t>
+      </w:r>
+      <w:proofErr w:type="spellEnd"/>
+      <w:r>
+        <w:t>=true) %}</w:t>
       </w:r>
       <w:r>
         <w:br/>
@@ -2324,7 +3772,15 @@
       </w:r>
       <w:r>
         <w:br/>
-        <w:t xml:space="preserve">        {% endfor %}</w:t>
+        <w:t xml:space="preserve">        {% </w:t>
+      </w:r>
+      <w:proofErr w:type="spellStart"/>
+      <w:r>
+        <w:t>endfor</w:t>
+      </w:r>
+      <w:proofErr w:type="spellEnd"/>
+      <w:r>
+        <w:t xml:space="preserve"> %}</w:t>
       </w:r>
       <w:r>
         <w:br/>
@@ -2336,7 +3792,15 @@
       </w:r>
       <w:r>
         <w:br/>
-        <w:t xml:space="preserve">    {% endwith %}</w:t>
+        <w:t xml:space="preserve">    {% </w:t>
+      </w:r>
+      <w:proofErr w:type="spellStart"/>
+      <w:r>
+        <w:t>endwith</w:t>
+      </w:r>
+      <w:proofErr w:type="spellEnd"/>
+      <w:r>
+        <w:t xml:space="preserve"> %}</w:t>
       </w:r>
       <w:r>
         <w:br/>
@@ -2352,7 +3816,23 @@
       </w:r>
       <w:r>
         <w:br/>
-        <w:t xml:space="preserve">        &lt;button class="btn btn-primary w-100"&gt;Login&lt;/button&gt;</w:t>
+        <w:t xml:space="preserve">        &lt;button class="</w:t>
+      </w:r>
+      <w:proofErr w:type="spellStart"/>
+      <w:r>
+        <w:t>btn</w:t>
+      </w:r>
+      <w:proofErr w:type="spellEnd"/>
+      <w:r>
+        <w:t xml:space="preserve"> </w:t>
+      </w:r>
+      <w:proofErr w:type="spellStart"/>
+      <w:r>
+        <w:t>btn</w:t>
+      </w:r>
+      <w:proofErr w:type="spellEnd"/>
+      <w:r>
+        <w:t>-primary w-100"&gt;Login&lt;/button&gt;</w:t>
       </w:r>
       <w:r>
         <w:br/>
@@ -2377,7 +3857,7 @@
     <w:p>
       <w:r>
         <w:pict w14:anchorId="4EF0F3C2">
-          <v:rect id="_x0000_i1134" style="width:0;height:1.5pt" o:hralign="center" o:hrstd="t" o:hr="t" fillcolor="#a0a0a0" stroked="f"/>
+          <v:rect id="_x0000_i1038" style="width:0;height:1.5pt" o:hralign="center" o:hrstd="t" o:hr="t" fillcolor="#a0a0a0" stroked="f"/>
         </w:pict>
       </w:r>
     </w:p>
@@ -2478,7 +3958,7 @@
     <w:p>
       <w:r>
         <w:pict w14:anchorId="0CC43771">
-          <v:rect id="_x0000_i1135" style="width:0;height:1.5pt" o:hralign="center" o:hrstd="t" o:hr="t" fillcolor="#a0a0a0" stroked="f"/>
+          <v:rect id="_x0000_i1039" style="width:0;height:1.5pt" o:hralign="center" o:hrstd="t" o:hr="t" fillcolor="#a0a0a0" stroked="f"/>
         </w:pict>
       </w:r>
     </w:p>
@@ -2518,23 +3998,44 @@
           <w:ilvl w:val="0"/>
           <w:numId w:val="10"/>
         </w:numPr>
-      </w:pPr>
-      <w:r>
+        <w:rPr>
+          <w:lang w:val="fr-FR"/>
+        </w:rPr>
+      </w:pPr>
+      <w:r>
+        <w:rPr>
+          <w:lang w:val="fr-FR"/>
+        </w:rPr>
         <w:t xml:space="preserve">Set environment variables on Render: </w:t>
       </w:r>
     </w:p>
     <w:p>
       <w:r>
-        <w:t>APP_USER=yourusername</w:t>
-      </w:r>
-      <w:r>
-        <w:br/>
-        <w:t>APP_PASS=strongpassword</w:t>
-      </w:r>
-      <w:r>
-        <w:br/>
-        <w:t>SECRET_KEY=randomstring</w:t>
-      </w:r>
+        <w:t>APP_USER=</w:t>
+      </w:r>
+      <w:proofErr w:type="spellStart"/>
+      <w:r>
+        <w:t>yourusername</w:t>
+      </w:r>
+      <w:proofErr w:type="spellEnd"/>
+      <w:r>
+        <w:br/>
+        <w:t>APP_PASS=</w:t>
+      </w:r>
+      <w:proofErr w:type="spellStart"/>
+      <w:r>
+        <w:t>strongpassword</w:t>
+      </w:r>
+      <w:proofErr w:type="spellEnd"/>
+      <w:r>
+        <w:br/>
+        <w:t>SECRET_KEY=</w:t>
+      </w:r>
+      <w:proofErr w:type="spellStart"/>
+      <w:r>
+        <w:t>randomstring</w:t>
+      </w:r>
+      <w:proofErr w:type="spellEnd"/>
     </w:p>
     <w:p>
       <w:pPr>
@@ -2565,7 +4066,7 @@
     <w:p>
       <w:r>
         <w:pict w14:anchorId="5E8F94FC">
-          <v:rect id="_x0000_i1136" style="width:0;height:1.5pt" o:hralign="center" o:hrstd="t" o:hr="t" fillcolor="#a0a0a0" stroked="f"/>
+          <v:rect id="_x0000_i1040" style="width:0;height:1.5pt" o:hralign="center" o:hrstd="t" o:hr="t" fillcolor="#a0a0a0" stroked="f"/>
         </w:pict>
       </w:r>
     </w:p>
@@ -2673,7 +4174,7 @@
     <w:p>
       <w:r>
         <w:pict w14:anchorId="45536475">
-          <v:rect id="_x0000_i1137" style="width:0;height:1.5pt" o:hralign="center" o:hrstd="t" o:hr="t" fillcolor="#a0a0a0" stroked="f"/>
+          <v:rect id="_x0000_i1041" style="width:0;height:1.5pt" o:hralign="center" o:hrstd="t" o:hr="t" fillcolor="#a0a0a0" stroked="f"/>
         </w:pict>
       </w:r>
     </w:p>
@@ -2732,8 +4233,29 @@
     </w:p>
     <w:p>
       <w:r>
-        <w:t>from flask import Flask, render_template, request, redirect, send_file, flash, session, url_for</w:t>
-      </w:r>
+        <w:t xml:space="preserve">from flask import Flask, </w:t>
+      </w:r>
+      <w:proofErr w:type="spellStart"/>
+      <w:r>
+        <w:t>render_template</w:t>
+      </w:r>
+      <w:proofErr w:type="spellEnd"/>
+      <w:r>
+        <w:t xml:space="preserve">, request, redirect, </w:t>
+      </w:r>
+      <w:proofErr w:type="spellStart"/>
+      <w:r>
+        <w:t>send_file</w:t>
+      </w:r>
+      <w:proofErr w:type="spellEnd"/>
+      <w:r>
+        <w:t xml:space="preserve">, flash, session, </w:t>
+      </w:r>
+      <w:proofErr w:type="spellStart"/>
+      <w:r>
+        <w:t>url_for</w:t>
+      </w:r>
+      <w:proofErr w:type="spellEnd"/>
       <w:r>
         <w:br/>
         <w:t>import sqlite3</w:t>
@@ -2744,18 +4266,36 @@
       </w:r>
       <w:r>
         <w:br/>
-        <w:t>from io import BytesIO</w:t>
-      </w:r>
-      <w:r>
-        <w:br/>
-        <w:t>import os</w:t>
-      </w:r>
-      <w:r>
-        <w:br/>
-      </w:r>
-      <w:r>
-        <w:br/>
-        <w:t>DB_NAME = "inventory.db"</w:t>
+        <w:t xml:space="preserve">from io import </w:t>
+      </w:r>
+      <w:proofErr w:type="spellStart"/>
+      <w:r>
+        <w:t>BytesIO</w:t>
+      </w:r>
+      <w:proofErr w:type="spellEnd"/>
+      <w:r>
+        <w:br/>
+        <w:t xml:space="preserve">import </w:t>
+      </w:r>
+      <w:proofErr w:type="spellStart"/>
+      <w:r>
+        <w:t>os</w:t>
+      </w:r>
+      <w:proofErr w:type="spellEnd"/>
+      <w:r>
+        <w:br/>
+      </w:r>
+      <w:r>
+        <w:br/>
+        <w:t>DB_NAME = "</w:t>
+      </w:r>
+      <w:proofErr w:type="spellStart"/>
+      <w:r>
+        <w:t>inventory.db</w:t>
+      </w:r>
+      <w:proofErr w:type="spellEnd"/>
+      <w:r>
+        <w:t>"</w:t>
       </w:r>
       <w:r>
         <w:br/>
@@ -2779,15 +4319,46 @@
       </w:r>
       <w:r>
         <w:br/>
-        <w:t>app.secret_key = os.environ["SECRET_KEY"]</w:t>
-      </w:r>
-      <w:r>
-        <w:br/>
-        <w:t>USERNAME = os.environ["APP_USER"]</w:t>
-      </w:r>
-      <w:r>
-        <w:br/>
-        <w:t>PASSWORD = os.environ["APP_PASS"]</w:t>
+      </w:r>
+      <w:proofErr w:type="spellStart"/>
+      <w:r>
+        <w:t>app.secret_key</w:t>
+      </w:r>
+      <w:proofErr w:type="spellEnd"/>
+      <w:r>
+        <w:t xml:space="preserve"> = </w:t>
+      </w:r>
+      <w:proofErr w:type="spellStart"/>
+      <w:r>
+        <w:t>os.environ</w:t>
+      </w:r>
+      <w:proofErr w:type="spellEnd"/>
+      <w:r>
+        <w:t>["SECRET_KEY"]</w:t>
+      </w:r>
+      <w:r>
+        <w:br/>
+        <w:t xml:space="preserve">USERNAME = </w:t>
+      </w:r>
+      <w:proofErr w:type="spellStart"/>
+      <w:r>
+        <w:t>os.environ</w:t>
+      </w:r>
+      <w:proofErr w:type="spellEnd"/>
+      <w:r>
+        <w:t>["APP_USER"]</w:t>
+      </w:r>
+      <w:r>
+        <w:br/>
+        <w:t xml:space="preserve">PASSWORD = </w:t>
+      </w:r>
+      <w:proofErr w:type="spellStart"/>
+      <w:r>
+        <w:t>os.environ</w:t>
+      </w:r>
+      <w:proofErr w:type="spellEnd"/>
+      <w:r>
+        <w:t>["APP_PASS"]</w:t>
       </w:r>
       <w:r>
         <w:br/>
@@ -2796,22 +4367,40 @@
         <w:br/>
         <w:t xml:space="preserve"># ---------- Login </w:t>
       </w:r>
+      <w:proofErr w:type="spellStart"/>
       <w:r>
         <w:rPr>
           <w:rFonts w:ascii="Arial" w:hAnsi="Arial" w:cs="Arial"/>
         </w:rPr>
         <w:t>حماية</w:t>
       </w:r>
+      <w:proofErr w:type="spellEnd"/>
       <w:r>
         <w:t xml:space="preserve"> ----------</w:t>
       </w:r>
       <w:r>
         <w:br/>
-        <w:t>def login_required(f):</w:t>
-      </w:r>
-      <w:r>
-        <w:br/>
-        <w:t xml:space="preserve">    from functools import wraps</w:t>
+        <w:t xml:space="preserve">def </w:t>
+      </w:r>
+      <w:proofErr w:type="spellStart"/>
+      <w:r>
+        <w:t>login_required</w:t>
+      </w:r>
+      <w:proofErr w:type="spellEnd"/>
+      <w:r>
+        <w:t>(f):</w:t>
+      </w:r>
+      <w:r>
+        <w:br/>
+        <w:t xml:space="preserve">    from </w:t>
+      </w:r>
+      <w:proofErr w:type="spellStart"/>
+      <w:r>
+        <w:t>functools</w:t>
+      </w:r>
+      <w:proofErr w:type="spellEnd"/>
+      <w:r>
+        <w:t xml:space="preserve"> import wraps</w:t>
       </w:r>
       <w:r>
         <w:br/>
@@ -2819,24 +4408,93 @@
       </w:r>
       <w:r>
         <w:br/>
-        <w:t xml:space="preserve">    def decorated_function(*args, **kwargs):</w:t>
-      </w:r>
-      <w:r>
-        <w:br/>
-        <w:t xml:space="preserve">        if not session.get("logged_in"):</w:t>
-      </w:r>
-      <w:r>
-        <w:br/>
-        <w:t xml:space="preserve">            return redirect(url_for("login"))</w:t>
-      </w:r>
-      <w:r>
-        <w:br/>
-        <w:t xml:space="preserve">        return f(*args, **kwargs)</w:t>
-      </w:r>
-      <w:r>
-        <w:br/>
-        <w:t xml:space="preserve">    return decorated_function</w:t>
-      </w:r>
+        <w:t xml:space="preserve">    def </w:t>
+      </w:r>
+      <w:proofErr w:type="spellStart"/>
+      <w:r>
+        <w:t>decorated_function</w:t>
+      </w:r>
+      <w:proofErr w:type="spellEnd"/>
+      <w:r>
+        <w:t>(*</w:t>
+      </w:r>
+      <w:proofErr w:type="spellStart"/>
+      <w:r>
+        <w:t>args</w:t>
+      </w:r>
+      <w:proofErr w:type="spellEnd"/>
+      <w:r>
+        <w:t>, **</w:t>
+      </w:r>
+      <w:proofErr w:type="spellStart"/>
+      <w:r>
+        <w:t>kwargs</w:t>
+      </w:r>
+      <w:proofErr w:type="spellEnd"/>
+      <w:r>
+        <w:t>):</w:t>
+      </w:r>
+      <w:r>
+        <w:br/>
+        <w:t xml:space="preserve">        if not </w:t>
+      </w:r>
+      <w:proofErr w:type="spellStart"/>
+      <w:r>
+        <w:t>session.get</w:t>
+      </w:r>
+      <w:proofErr w:type="spellEnd"/>
+      <w:r>
+        <w:t>("</w:t>
+      </w:r>
+      <w:proofErr w:type="spellStart"/>
+      <w:r>
+        <w:t>logged_in</w:t>
+      </w:r>
+      <w:proofErr w:type="spellEnd"/>
+      <w:r>
+        <w:t>"):</w:t>
+      </w:r>
+      <w:r>
+        <w:br/>
+        <w:t xml:space="preserve">            return redirect(</w:t>
+      </w:r>
+      <w:proofErr w:type="spellStart"/>
+      <w:r>
+        <w:t>url_for</w:t>
+      </w:r>
+      <w:proofErr w:type="spellEnd"/>
+      <w:r>
+        <w:t>("login"))</w:t>
+      </w:r>
+      <w:r>
+        <w:br/>
+        <w:t xml:space="preserve">        return f(*</w:t>
+      </w:r>
+      <w:proofErr w:type="spellStart"/>
+      <w:r>
+        <w:t>args</w:t>
+      </w:r>
+      <w:proofErr w:type="spellEnd"/>
+      <w:r>
+        <w:t>, **</w:t>
+      </w:r>
+      <w:proofErr w:type="spellStart"/>
+      <w:r>
+        <w:t>kwargs</w:t>
+      </w:r>
+      <w:proofErr w:type="spellEnd"/>
+      <w:r>
+        <w:t>)</w:t>
+      </w:r>
+      <w:r>
+        <w:br/>
+        <w:t xml:space="preserve">    return </w:t>
+      </w:r>
+      <w:proofErr w:type="spellStart"/>
+      <w:r>
+        <w:t>decorated_function</w:t>
+      </w:r>
+      <w:proofErr w:type="spellEnd"/>
       <w:r>
         <w:br/>
       </w:r>
@@ -2846,7 +4504,15 @@
       </w:r>
       <w:r>
         <w:br/>
-        <w:t>def init_db():</w:t>
+        <w:t xml:space="preserve">def </w:t>
+      </w:r>
+      <w:proofErr w:type="spellStart"/>
+      <w:r>
+        <w:t>init_db</w:t>
+      </w:r>
+      <w:proofErr w:type="spellEnd"/>
+      <w:r>
+        <w:t>():</w:t>
       </w:r>
       <w:r>
         <w:br/>
@@ -2854,11 +4520,27 @@
       </w:r>
       <w:r>
         <w:br/>
-        <w:t xml:space="preserve">    cursor = conn.cursor()</w:t>
-      </w:r>
-      <w:r>
-        <w:br/>
-        <w:t xml:space="preserve">    cursor.execute("""</w:t>
+        <w:t xml:space="preserve">    cursor = </w:t>
+      </w:r>
+      <w:proofErr w:type="spellStart"/>
+      <w:r>
+        <w:t>conn.cursor</w:t>
+      </w:r>
+      <w:proofErr w:type="spellEnd"/>
+      <w:r>
+        <w:t>()</w:t>
+      </w:r>
+      <w:r>
+        <w:br/>
+        <w:t xml:space="preserve">    </w:t>
+      </w:r>
+      <w:proofErr w:type="spellStart"/>
+      <w:r>
+        <w:t>cursor.execute</w:t>
+      </w:r>
+      <w:proofErr w:type="spellEnd"/>
+      <w:r>
+        <w:t>("""</w:t>
       </w:r>
       <w:r>
         <w:br/>
@@ -2869,11 +4551,27 @@
       </w:r>
       <w:r>
         <w:br/>
-        <w:t xml:space="preserve">            product_no TEXT PRIMARY KEY,</w:t>
-      </w:r>
-      <w:r>
-        <w:br/>
-        <w:t xml:space="preserve">            item_name TEXT,</w:t>
+        <w:t xml:space="preserve">            </w:t>
+      </w:r>
+      <w:proofErr w:type="spellStart"/>
+      <w:r>
+        <w:t>product_no</w:t>
+      </w:r>
+      <w:proofErr w:type="spellEnd"/>
+      <w:r>
+        <w:t xml:space="preserve"> TEXT PRIMARY KEY,</w:t>
+      </w:r>
+      <w:r>
+        <w:br/>
+        <w:t xml:space="preserve">            </w:t>
+      </w:r>
+      <w:proofErr w:type="spellStart"/>
+      <w:r>
+        <w:t>item_name</w:t>
+      </w:r>
+      <w:proofErr w:type="spellEnd"/>
+      <w:r>
+        <w:t xml:space="preserve"> TEXT,</w:t>
       </w:r>
       <w:r>
         <w:br/>
@@ -2889,18 +4587,42 @@
       </w:r>
       <w:r>
         <w:br/>
-        <w:t xml:space="preserve">    conn.commit()</w:t>
-      </w:r>
-      <w:r>
-        <w:br/>
-        <w:t xml:space="preserve">    conn.close()</w:t>
-      </w:r>
-      <w:r>
-        <w:br/>
-      </w:r>
-      <w:r>
-        <w:br/>
-        <w:t>def run_query(query, params=()):</w:t>
+        <w:t xml:space="preserve">    </w:t>
+      </w:r>
+      <w:proofErr w:type="spellStart"/>
+      <w:r>
+        <w:t>conn.commit</w:t>
+      </w:r>
+      <w:proofErr w:type="spellEnd"/>
+      <w:r>
+        <w:t>()</w:t>
+      </w:r>
+      <w:r>
+        <w:br/>
+        <w:t xml:space="preserve">    </w:t>
+      </w:r>
+      <w:proofErr w:type="spellStart"/>
+      <w:r>
+        <w:t>conn.close</w:t>
+      </w:r>
+      <w:proofErr w:type="spellEnd"/>
+      <w:r>
+        <w:t>()</w:t>
+      </w:r>
+      <w:r>
+        <w:br/>
+      </w:r>
+      <w:r>
+        <w:br/>
+        <w:t xml:space="preserve">def </w:t>
+      </w:r>
+      <w:proofErr w:type="spellStart"/>
+      <w:r>
+        <w:t>run_query</w:t>
+      </w:r>
+      <w:proofErr w:type="spellEnd"/>
+      <w:r>
+        <w:t>(query, params=()):</w:t>
       </w:r>
       <w:r>
         <w:br/>
@@ -2908,23 +4630,63 @@
       </w:r>
       <w:r>
         <w:br/>
-        <w:t xml:space="preserve">    cursor = conn.cursor()</w:t>
-      </w:r>
-      <w:r>
-        <w:br/>
-        <w:t xml:space="preserve">    cursor.execute(query, params)</w:t>
-      </w:r>
-      <w:r>
-        <w:br/>
-        <w:t xml:space="preserve">    conn.commit()</w:t>
-      </w:r>
-      <w:r>
-        <w:br/>
-        <w:t xml:space="preserve">    data = cursor.fetchall()</w:t>
-      </w:r>
-      <w:r>
-        <w:br/>
-        <w:t xml:space="preserve">    conn.close()</w:t>
+        <w:t xml:space="preserve">    cursor = </w:t>
+      </w:r>
+      <w:proofErr w:type="spellStart"/>
+      <w:r>
+        <w:t>conn.cursor</w:t>
+      </w:r>
+      <w:proofErr w:type="spellEnd"/>
+      <w:r>
+        <w:t>()</w:t>
+      </w:r>
+      <w:r>
+        <w:br/>
+        <w:t xml:space="preserve">    </w:t>
+      </w:r>
+      <w:proofErr w:type="spellStart"/>
+      <w:r>
+        <w:t>cursor.execute</w:t>
+      </w:r>
+      <w:proofErr w:type="spellEnd"/>
+      <w:r>
+        <w:t>(query, params)</w:t>
+      </w:r>
+      <w:r>
+        <w:br/>
+        <w:t xml:space="preserve">    </w:t>
+      </w:r>
+      <w:proofErr w:type="spellStart"/>
+      <w:r>
+        <w:t>conn.commit</w:t>
+      </w:r>
+      <w:proofErr w:type="spellEnd"/>
+      <w:r>
+        <w:t>()</w:t>
+      </w:r>
+      <w:r>
+        <w:br/>
+        <w:t xml:space="preserve">    data = </w:t>
+      </w:r>
+      <w:proofErr w:type="spellStart"/>
+      <w:r>
+        <w:t>cursor.fetchall</w:t>
+      </w:r>
+      <w:proofErr w:type="spellEnd"/>
+      <w:r>
+        <w:t>()</w:t>
+      </w:r>
+      <w:r>
+        <w:br/>
+        <w:t xml:space="preserve">    </w:t>
+      </w:r>
+      <w:proofErr w:type="spellStart"/>
+      <w:r>
+        <w:t>conn.close</w:t>
+      </w:r>
+      <w:proofErr w:type="spellEnd"/>
+      <w:r>
+        <w:t>()</w:t>
       </w:r>
       <w:r>
         <w:br/>
@@ -2947,26 +4709,74 @@
       </w:r>
       <w:r>
         <w:br/>
-        <w:t xml:space="preserve">    if request.method == "POST":</w:t>
-      </w:r>
-      <w:r>
-        <w:br/>
-        <w:t xml:space="preserve">        user = request.form.get("username")</w:t>
-      </w:r>
-      <w:r>
-        <w:br/>
-        <w:t xml:space="preserve">        pwd = request.form.get("password")</w:t>
-      </w:r>
-      <w:r>
-        <w:br/>
-      </w:r>
-      <w:r>
-        <w:br/>
-        <w:t xml:space="preserve">        if user == USERNAME and pwd == PASSWORD:</w:t>
-      </w:r>
-      <w:r>
-        <w:br/>
-        <w:t xml:space="preserve">            session["logged_in"] = True</w:t>
+        <w:t xml:space="preserve">    if </w:t>
+      </w:r>
+      <w:proofErr w:type="spellStart"/>
+      <w:r>
+        <w:t>request.method</w:t>
+      </w:r>
+      <w:proofErr w:type="spellEnd"/>
+      <w:r>
+        <w:t xml:space="preserve"> == "POST":</w:t>
+      </w:r>
+      <w:r>
+        <w:br/>
+        <w:t xml:space="preserve">        user = </w:t>
+      </w:r>
+      <w:proofErr w:type="spellStart"/>
+      <w:r>
+        <w:t>request.form.get</w:t>
+      </w:r>
+      <w:proofErr w:type="spellEnd"/>
+      <w:r>
+        <w:t>("username")</w:t>
+      </w:r>
+      <w:r>
+        <w:br/>
+        <w:t xml:space="preserve">        </w:t>
+      </w:r>
+      <w:proofErr w:type="spellStart"/>
+      <w:r>
+        <w:t>pwd</w:t>
+      </w:r>
+      <w:proofErr w:type="spellEnd"/>
+      <w:r>
+        <w:t xml:space="preserve"> = </w:t>
+      </w:r>
+      <w:proofErr w:type="spellStart"/>
+      <w:r>
+        <w:t>request.form.get</w:t>
+      </w:r>
+      <w:proofErr w:type="spellEnd"/>
+      <w:r>
+        <w:t>("password")</w:t>
+      </w:r>
+      <w:r>
+        <w:br/>
+      </w:r>
+      <w:r>
+        <w:br/>
+        <w:t xml:space="preserve">        if user == USERNAME and </w:t>
+      </w:r>
+      <w:proofErr w:type="spellStart"/>
+      <w:r>
+        <w:t>pwd</w:t>
+      </w:r>
+      <w:proofErr w:type="spellEnd"/>
+      <w:r>
+        <w:t xml:space="preserve"> == PASSWORD:</w:t>
+      </w:r>
+      <w:r>
+        <w:br/>
+        <w:t xml:space="preserve">            session["</w:t>
+      </w:r>
+      <w:proofErr w:type="spellStart"/>
+      <w:r>
+        <w:t>logged_in</w:t>
+      </w:r>
+      <w:proofErr w:type="spellEnd"/>
+      <w:r>
+        <w:t>"] = True</w:t>
       </w:r>
       <w:r>
         <w:br/>
@@ -2993,7 +4803,15 @@
       </w:r>
       <w:r>
         <w:br/>
-        <w:t xml:space="preserve">    return render_template("login.html")</w:t>
+        <w:t xml:space="preserve">    return </w:t>
+      </w:r>
+      <w:proofErr w:type="spellStart"/>
+      <w:r>
+        <w:t>render_template</w:t>
+      </w:r>
+      <w:proofErr w:type="spellEnd"/>
+      <w:r>
+        <w:t>("login.html")</w:t>
       </w:r>
       <w:r>
         <w:br/>
@@ -3015,7 +4833,15 @@
       </w:r>
       <w:r>
         <w:lastRenderedPageBreak/>
-        <w:t xml:space="preserve">    session.clear()</w:t>
+        <w:t xml:space="preserve">    </w:t>
+      </w:r>
+      <w:proofErr w:type="spellStart"/>
+      <w:r>
+        <w:t>session.clear</w:t>
+      </w:r>
+      <w:proofErr w:type="spellEnd"/>
+      <w:r>
+        <w:t>()</w:t>
       </w:r>
       <w:r>
         <w:br/>
@@ -3042,19 +4868,51 @@
       </w:r>
       <w:r>
         <w:br/>
-        <w:t xml:space="preserve">    if request.method == "POST":</w:t>
-      </w:r>
-      <w:r>
-        <w:br/>
-        <w:t xml:space="preserve">        product = request.form.get("product").strip()</w:t>
-      </w:r>
-      <w:r>
-        <w:br/>
-        <w:t xml:space="preserve">        name = request.form.get("name").strip()</w:t>
-      </w:r>
-      <w:r>
-        <w:br/>
-        <w:t xml:space="preserve">        qty = request.form.get("quantity").strip()</w:t>
+        <w:t xml:space="preserve">    if </w:t>
+      </w:r>
+      <w:proofErr w:type="spellStart"/>
+      <w:r>
+        <w:t>request.method</w:t>
+      </w:r>
+      <w:proofErr w:type="spellEnd"/>
+      <w:r>
+        <w:t xml:space="preserve"> == "POST":</w:t>
+      </w:r>
+      <w:r>
+        <w:br/>
+        <w:t xml:space="preserve">        product = </w:t>
+      </w:r>
+      <w:proofErr w:type="spellStart"/>
+      <w:r>
+        <w:t>request.form.get</w:t>
+      </w:r>
+      <w:proofErr w:type="spellEnd"/>
+      <w:r>
+        <w:t>("product").strip()</w:t>
+      </w:r>
+      <w:r>
+        <w:br/>
+        <w:t xml:space="preserve">        name = </w:t>
+      </w:r>
+      <w:proofErr w:type="spellStart"/>
+      <w:r>
+        <w:t>request.form.get</w:t>
+      </w:r>
+      <w:proofErr w:type="spellEnd"/>
+      <w:r>
+        <w:t>("name").strip()</w:t>
+      </w:r>
+      <w:r>
+        <w:br/>
+        <w:t xml:space="preserve">        qty = </w:t>
+      </w:r>
+      <w:proofErr w:type="spellStart"/>
+      <w:r>
+        <w:t>request.form.get</w:t>
+      </w:r>
+      <w:proofErr w:type="spellEnd"/>
+      <w:r>
+        <w:t>("quantity").strip()</w:t>
       </w:r>
       <w:r>
         <w:br/>
@@ -3069,7 +4927,15 @@
       </w:r>
       <w:r>
         <w:br/>
-        <w:t xml:space="preserve">            run_query("INSERT INTO inventory VALUES (?, ?, ?)", (product, name, qty))</w:t>
+        <w:t xml:space="preserve">            </w:t>
+      </w:r>
+      <w:proofErr w:type="spellStart"/>
+      <w:r>
+        <w:t>run_query</w:t>
+      </w:r>
+      <w:proofErr w:type="spellEnd"/>
+      <w:r>
+        <w:t>("INSERT INTO inventory VALUES (?, ?, ?)", (product, name, qty))</w:t>
       </w:r>
       <w:r>
         <w:br/>
@@ -3095,11 +4961,27 @@
       </w:r>
       <w:r>
         <w:br/>
-        <w:t xml:space="preserve">    items = run_query("SELECT * FROM inventory")</w:t>
-      </w:r>
-      <w:r>
-        <w:br/>
-        <w:t xml:space="preserve">    return render_template("index.html", items=items)</w:t>
+        <w:t xml:space="preserve">    items = </w:t>
+      </w:r>
+      <w:proofErr w:type="spellStart"/>
+      <w:r>
+        <w:t>run_query</w:t>
+      </w:r>
+      <w:proofErr w:type="spellEnd"/>
+      <w:r>
+        <w:t>("SELECT * FROM inventory")</w:t>
+      </w:r>
+      <w:r>
+        <w:br/>
+        <w:t xml:space="preserve">    return </w:t>
+      </w:r>
+      <w:proofErr w:type="spellStart"/>
+      <w:r>
+        <w:t>render_template</w:t>
+      </w:r>
+      <w:proofErr w:type="spellEnd"/>
+      <w:r>
+        <w:t>("index.html", items=items)</w:t>
       </w:r>
       <w:r>
         <w:br/>
@@ -3114,11 +4996,43 @@
       </w:r>
       <w:r>
         <w:br/>
-        <w:t>def delete(product_no):</w:t>
-      </w:r>
-      <w:r>
-        <w:br/>
-        <w:t xml:space="preserve">    run_query("DELETE FROM inventory WHERE product_no=?", (product_no,))</w:t>
+        <w:t>def delete(</w:t>
+      </w:r>
+      <w:proofErr w:type="spellStart"/>
+      <w:r>
+        <w:t>product_no</w:t>
+      </w:r>
+      <w:proofErr w:type="spellEnd"/>
+      <w:r>
+        <w:t>):</w:t>
+      </w:r>
+      <w:r>
+        <w:br/>
+        <w:t xml:space="preserve">    </w:t>
+      </w:r>
+      <w:proofErr w:type="spellStart"/>
+      <w:r>
+        <w:t>run_query</w:t>
+      </w:r>
+      <w:proofErr w:type="spellEnd"/>
+      <w:r>
+        <w:t xml:space="preserve">("DELETE FROM inventory WHERE </w:t>
+      </w:r>
+      <w:proofErr w:type="spellStart"/>
+      <w:r>
+        <w:t>product_no</w:t>
+      </w:r>
+      <w:proofErr w:type="spellEnd"/>
+      <w:r>
+        <w:t>=?", (</w:t>
+      </w:r>
+      <w:proofErr w:type="spellStart"/>
+      <w:r>
+        <w:t>product_no</w:t>
+      </w:r>
+      <w:proofErr w:type="spellEnd"/>
+      <w:r>
+        <w:t>,))</w:t>
       </w:r>
       <w:r>
         <w:br/>
@@ -3141,15 +5055,39 @@
       </w:r>
       <w:r>
         <w:br/>
-        <w:t>def edit(product_no):</w:t>
-      </w:r>
-      <w:r>
-        <w:br/>
-        <w:t xml:space="preserve">    if request.method == "POST":</w:t>
-      </w:r>
-      <w:r>
-        <w:br/>
-        <w:t xml:space="preserve">        qty = request.form.get("quantity")</w:t>
+        <w:t>def edit(</w:t>
+      </w:r>
+      <w:proofErr w:type="spellStart"/>
+      <w:r>
+        <w:t>product_no</w:t>
+      </w:r>
+      <w:proofErr w:type="spellEnd"/>
+      <w:r>
+        <w:t>):</w:t>
+      </w:r>
+      <w:r>
+        <w:br/>
+        <w:t xml:space="preserve">    if </w:t>
+      </w:r>
+      <w:proofErr w:type="spellStart"/>
+      <w:r>
+        <w:t>request.method</w:t>
+      </w:r>
+      <w:proofErr w:type="spellEnd"/>
+      <w:r>
+        <w:t xml:space="preserve"> == "POST":</w:t>
+      </w:r>
+      <w:r>
+        <w:br/>
+        <w:t xml:space="preserve">        qty = </w:t>
+      </w:r>
+      <w:proofErr w:type="spellStart"/>
+      <w:r>
+        <w:t>request.form.get</w:t>
+      </w:r>
+      <w:proofErr w:type="spellEnd"/>
+      <w:r>
+        <w:t>("quantity")</w:t>
       </w:r>
       <w:r>
         <w:br/>
@@ -3164,7 +5102,31 @@
       </w:r>
       <w:r>
         <w:lastRenderedPageBreak/>
-        <w:t xml:space="preserve">            run_query("UPDATE inventory SET quantity=? WHERE product_no=?", (qty, product_no))</w:t>
+        <w:t xml:space="preserve">            </w:t>
+      </w:r>
+      <w:proofErr w:type="spellStart"/>
+      <w:r>
+        <w:t>run_query</w:t>
+      </w:r>
+      <w:proofErr w:type="spellEnd"/>
+      <w:r>
+        <w:t xml:space="preserve">("UPDATE inventory SET quantity=? WHERE </w:t>
+      </w:r>
+      <w:proofErr w:type="spellStart"/>
+      <w:r>
+        <w:t>product_no</w:t>
+      </w:r>
+      <w:proofErr w:type="spellEnd"/>
+      <w:r>
+        <w:t xml:space="preserve">=?", (qty, </w:t>
+      </w:r>
+      <w:proofErr w:type="spellStart"/>
+      <w:r>
+        <w:t>product_no</w:t>
+      </w:r>
+      <w:proofErr w:type="spellEnd"/>
+      <w:r>
+        <w:t>))</w:t>
       </w:r>
       <w:r>
         <w:br/>
@@ -3190,11 +5152,43 @@
       </w:r>
       <w:r>
         <w:br/>
-        <w:t xml:space="preserve">    item = run_query("SELECT * FROM inventory WHERE product_no=?", (product_no,))</w:t>
-      </w:r>
-      <w:r>
-        <w:br/>
-        <w:t xml:space="preserve">    return render_template("edit.html", item=item[0])</w:t>
+        <w:t xml:space="preserve">    item = </w:t>
+      </w:r>
+      <w:proofErr w:type="spellStart"/>
+      <w:r>
+        <w:t>run_query</w:t>
+      </w:r>
+      <w:proofErr w:type="spellEnd"/>
+      <w:r>
+        <w:t xml:space="preserve">("SELECT * FROM inventory WHERE </w:t>
+      </w:r>
+      <w:proofErr w:type="spellStart"/>
+      <w:r>
+        <w:t>product_no</w:t>
+      </w:r>
+      <w:proofErr w:type="spellEnd"/>
+      <w:r>
+        <w:t>=?", (</w:t>
+      </w:r>
+      <w:proofErr w:type="spellStart"/>
+      <w:r>
+        <w:t>product_no</w:t>
+      </w:r>
+      <w:proofErr w:type="spellEnd"/>
+      <w:r>
+        <w:t>,))</w:t>
+      </w:r>
+      <w:r>
+        <w:br/>
+        <w:t xml:space="preserve">    return </w:t>
+      </w:r>
+      <w:proofErr w:type="spellStart"/>
+      <w:r>
+        <w:t>render_template</w:t>
+      </w:r>
+      <w:proofErr w:type="spellEnd"/>
+      <w:r>
+        <w:t>("edit.html", item=item[0])</w:t>
       </w:r>
       <w:r>
         <w:br/>
@@ -3213,7 +5207,15 @@
       </w:r>
       <w:r>
         <w:br/>
-        <w:t xml:space="preserve">    file = request.files.get("file")</w:t>
+        <w:t xml:space="preserve">    file = </w:t>
+      </w:r>
+      <w:proofErr w:type="spellStart"/>
+      <w:r>
+        <w:t>request.files.get</w:t>
+      </w:r>
+      <w:proofErr w:type="spellEnd"/>
+      <w:r>
+        <w:t>("file")</w:t>
       </w:r>
       <w:r>
         <w:br/>
@@ -3232,44 +5234,124 @@
       </w:r>
       <w:r>
         <w:br/>
-        <w:t xml:space="preserve">    df = pd.read_excel(file)</w:t>
-      </w:r>
-      <w:r>
-        <w:br/>
-        <w:t xml:space="preserve">    existing = set(x[0] for x in run_query("SELECT product_no FROM inventory"))</w:t>
-      </w:r>
-      <w:r>
-        <w:br/>
-      </w:r>
-      <w:r>
-        <w:br/>
-        <w:t xml:space="preserve">    new_count = 0</w:t>
-      </w:r>
-      <w:r>
-        <w:br/>
-        <w:t xml:space="preserve">    duplicate_count = 0</w:t>
-      </w:r>
-      <w:r>
-        <w:br/>
-      </w:r>
-      <w:r>
-        <w:br/>
-        <w:t xml:space="preserve">    for _, row in df.iterrows():</w:t>
-      </w:r>
-      <w:r>
-        <w:br/>
-        <w:t xml:space="preserve">        product = str(row.iloc[0]).strip()</w:t>
-      </w:r>
-      <w:r>
-        <w:br/>
-        <w:t xml:space="preserve">        name = str(row.iloc[1]).strip()</w:t>
-      </w:r>
-      <w:r>
-        <w:br/>
-      </w:r>
-      <w:r>
-        <w:br/>
-        <w:t xml:space="preserve">        if not product or product.lower() == "nan":</w:t>
+        <w:t xml:space="preserve">    </w:t>
+      </w:r>
+      <w:proofErr w:type="spellStart"/>
+      <w:r>
+        <w:t>df</w:t>
+      </w:r>
+      <w:proofErr w:type="spellEnd"/>
+      <w:r>
+        <w:t xml:space="preserve"> = </w:t>
+      </w:r>
+      <w:proofErr w:type="spellStart"/>
+      <w:r>
+        <w:t>pd.read_excel</w:t>
+      </w:r>
+      <w:proofErr w:type="spellEnd"/>
+      <w:r>
+        <w:t>(file)</w:t>
+      </w:r>
+      <w:r>
+        <w:br/>
+        <w:t xml:space="preserve">    existing = set(x[0] for x in </w:t>
+      </w:r>
+      <w:proofErr w:type="spellStart"/>
+      <w:r>
+        <w:t>run_query</w:t>
+      </w:r>
+      <w:proofErr w:type="spellEnd"/>
+      <w:r>
+        <w:t xml:space="preserve">("SELECT </w:t>
+      </w:r>
+      <w:proofErr w:type="spellStart"/>
+      <w:r>
+        <w:t>product_no</w:t>
+      </w:r>
+      <w:proofErr w:type="spellEnd"/>
+      <w:r>
+        <w:t xml:space="preserve"> FROM inventory"))</w:t>
+      </w:r>
+      <w:r>
+        <w:br/>
+      </w:r>
+      <w:r>
+        <w:br/>
+        <w:t xml:space="preserve">    </w:t>
+      </w:r>
+      <w:proofErr w:type="spellStart"/>
+      <w:r>
+        <w:t>new_count</w:t>
+      </w:r>
+      <w:proofErr w:type="spellEnd"/>
+      <w:r>
+        <w:t xml:space="preserve"> = 0</w:t>
+      </w:r>
+      <w:r>
+        <w:br/>
+        <w:t xml:space="preserve">    </w:t>
+      </w:r>
+      <w:proofErr w:type="spellStart"/>
+      <w:r>
+        <w:t>duplicate_count</w:t>
+      </w:r>
+      <w:proofErr w:type="spellEnd"/>
+      <w:r>
+        <w:t xml:space="preserve"> = 0</w:t>
+      </w:r>
+      <w:r>
+        <w:br/>
+      </w:r>
+      <w:r>
+        <w:br/>
+        <w:t xml:space="preserve">    for _, row in </w:t>
+      </w:r>
+      <w:proofErr w:type="spellStart"/>
+      <w:r>
+        <w:t>df.iterrows</w:t>
+      </w:r>
+      <w:proofErr w:type="spellEnd"/>
+      <w:r>
+        <w:t>():</w:t>
+      </w:r>
+      <w:r>
+        <w:br/>
+        <w:t xml:space="preserve">        product = str(</w:t>
+      </w:r>
+      <w:proofErr w:type="spellStart"/>
+      <w:r>
+        <w:t>row.iloc</w:t>
+      </w:r>
+      <w:proofErr w:type="spellEnd"/>
+      <w:r>
+        <w:t>[0]).strip()</w:t>
+      </w:r>
+      <w:r>
+        <w:br/>
+        <w:t xml:space="preserve">        name = str(</w:t>
+      </w:r>
+      <w:proofErr w:type="spellStart"/>
+      <w:r>
+        <w:t>row.iloc</w:t>
+      </w:r>
+      <w:proofErr w:type="spellEnd"/>
+      <w:r>
+        <w:t>[1]).strip()</w:t>
+      </w:r>
+      <w:r>
+        <w:br/>
+      </w:r>
+      <w:r>
+        <w:br/>
+        <w:t xml:space="preserve">        if not product or </w:t>
+      </w:r>
+      <w:proofErr w:type="spellStart"/>
+      <w:r>
+        <w:t>product.lower</w:t>
+      </w:r>
+      <w:proofErr w:type="spellEnd"/>
+      <w:r>
+        <w:t>() == "nan":</w:t>
       </w:r>
       <w:r>
         <w:br/>
@@ -3284,7 +5366,15 @@
       </w:r>
       <w:r>
         <w:br/>
-        <w:t xml:space="preserve">            duplicate_count += 1</w:t>
+        <w:t xml:space="preserve">            </w:t>
+      </w:r>
+      <w:proofErr w:type="spellStart"/>
+      <w:r>
+        <w:t>duplicate_count</w:t>
+      </w:r>
+      <w:proofErr w:type="spellEnd"/>
+      <w:r>
+        <w:t xml:space="preserve"> += 1</w:t>
       </w:r>
       <w:r>
         <w:br/>
@@ -3295,25 +5385,73 @@
       </w:r>
       <w:r>
         <w:br/>
-        <w:t xml:space="preserve">        run_query("INSERT INTO inventory VALUES (?, ?, ?)", (product, name, None))</w:t>
-      </w:r>
-      <w:r>
-        <w:br/>
-        <w:t xml:space="preserve">        existing.add(product)</w:t>
+        <w:t xml:space="preserve">        </w:t>
+      </w:r>
+      <w:proofErr w:type="spellStart"/>
+      <w:r>
+        <w:t>run_query</w:t>
+      </w:r>
+      <w:proofErr w:type="spellEnd"/>
+      <w:r>
+        <w:t>("INSERT INTO inventory VALUES (?, ?, ?)", (product, name, None))</w:t>
+      </w:r>
+      <w:r>
+        <w:br/>
+        <w:t xml:space="preserve">        </w:t>
+      </w:r>
+      <w:proofErr w:type="spellStart"/>
+      <w:r>
+        <w:t>existing.add</w:t>
+      </w:r>
+      <w:proofErr w:type="spellEnd"/>
+      <w:r>
+        <w:t>(product)</w:t>
       </w:r>
       <w:r>
         <w:br/>
       </w:r>
       <w:r>
         <w:lastRenderedPageBreak/>
-        <w:t xml:space="preserve">        new_count += 1</w:t>
-      </w:r>
-      <w:r>
-        <w:br/>
-      </w:r>
-      <w:r>
-        <w:br/>
-        <w:t xml:space="preserve">    flash(f"Upload Summary: New: {new_count}, Duplicates: {duplicate_count}", "info")</w:t>
+        <w:t xml:space="preserve">        </w:t>
+      </w:r>
+      <w:proofErr w:type="spellStart"/>
+      <w:r>
+        <w:t>new_count</w:t>
+      </w:r>
+      <w:proofErr w:type="spellEnd"/>
+      <w:r>
+        <w:t xml:space="preserve"> += 1</w:t>
+      </w:r>
+      <w:r>
+        <w:br/>
+      </w:r>
+      <w:r>
+        <w:br/>
+        <w:t xml:space="preserve">    flash(</w:t>
+      </w:r>
+      <w:proofErr w:type="spellStart"/>
+      <w:r>
+        <w:t>f"Upload</w:t>
+      </w:r>
+      <w:proofErr w:type="spellEnd"/>
+      <w:r>
+        <w:t xml:space="preserve"> Summary: New: {</w:t>
+      </w:r>
+      <w:proofErr w:type="spellStart"/>
+      <w:r>
+        <w:t>new_count</w:t>
+      </w:r>
+      <w:proofErr w:type="spellEnd"/>
+      <w:r>
+        <w:t>}, Duplicates: {</w:t>
+      </w:r>
+      <w:proofErr w:type="spellStart"/>
+      <w:r>
+        <w:t>duplicate_count</w:t>
+      </w:r>
+      <w:proofErr w:type="spellEnd"/>
+      <w:r>
+        <w:t>}", "info")</w:t>
       </w:r>
       <w:r>
         <w:br/>
@@ -3336,33 +5474,105 @@
       </w:r>
       <w:r>
         <w:br/>
-        <w:t xml:space="preserve">    data = run_query("SELECT * FROM inventory")</w:t>
-      </w:r>
-      <w:r>
-        <w:br/>
-        <w:t xml:space="preserve">    df = pd.DataFrame(data, columns=["Product#", "Item Name", "Quantity"])</w:t>
-      </w:r>
-      <w:r>
-        <w:br/>
-      </w:r>
-      <w:r>
-        <w:br/>
-        <w:t xml:space="preserve">    output = BytesIO()</w:t>
-      </w:r>
-      <w:r>
-        <w:br/>
-        <w:t xml:space="preserve">    df.to_excel(output, index=False)</w:t>
-      </w:r>
-      <w:r>
-        <w:br/>
-        <w:t xml:space="preserve">    output.seek(0)</w:t>
-      </w:r>
-      <w:r>
-        <w:br/>
-      </w:r>
-      <w:r>
-        <w:br/>
-        <w:t xml:space="preserve">    return send_file(output, download_name="inventory.xlsx", as_attachment=True)</w:t>
+        <w:t xml:space="preserve">    data = </w:t>
+      </w:r>
+      <w:proofErr w:type="spellStart"/>
+      <w:r>
+        <w:t>run_query</w:t>
+      </w:r>
+      <w:proofErr w:type="spellEnd"/>
+      <w:r>
+        <w:t>("SELECT * FROM inventory")</w:t>
+      </w:r>
+      <w:r>
+        <w:br/>
+        <w:t xml:space="preserve">    </w:t>
+      </w:r>
+      <w:proofErr w:type="spellStart"/>
+      <w:r>
+        <w:t>df</w:t>
+      </w:r>
+      <w:proofErr w:type="spellEnd"/>
+      <w:r>
+        <w:t xml:space="preserve"> = </w:t>
+      </w:r>
+      <w:proofErr w:type="spellStart"/>
+      <w:r>
+        <w:t>pd.DataFrame</w:t>
+      </w:r>
+      <w:proofErr w:type="spellEnd"/>
+      <w:r>
+        <w:t>(data, columns=["Product#", "Item Name", "Quantity"])</w:t>
+      </w:r>
+      <w:r>
+        <w:br/>
+      </w:r>
+      <w:r>
+        <w:br/>
+        <w:t xml:space="preserve">    output = </w:t>
+      </w:r>
+      <w:proofErr w:type="spellStart"/>
+      <w:r>
+        <w:t>BytesIO</w:t>
+      </w:r>
+      <w:proofErr w:type="spellEnd"/>
+      <w:r>
+        <w:t>()</w:t>
+      </w:r>
+      <w:r>
+        <w:br/>
+        <w:t xml:space="preserve">    </w:t>
+      </w:r>
+      <w:proofErr w:type="spellStart"/>
+      <w:r>
+        <w:t>df.to_excel</w:t>
+      </w:r>
+      <w:proofErr w:type="spellEnd"/>
+      <w:r>
+        <w:t>(output, index=False)</w:t>
+      </w:r>
+      <w:r>
+        <w:br/>
+        <w:t xml:space="preserve">    </w:t>
+      </w:r>
+      <w:proofErr w:type="spellStart"/>
+      <w:r>
+        <w:t>output.seek</w:t>
+      </w:r>
+      <w:proofErr w:type="spellEnd"/>
+      <w:r>
+        <w:t>(0)</w:t>
+      </w:r>
+      <w:r>
+        <w:br/>
+      </w:r>
+      <w:r>
+        <w:br/>
+        <w:t xml:space="preserve">    return </w:t>
+      </w:r>
+      <w:proofErr w:type="spellStart"/>
+      <w:r>
+        <w:t>send_file</w:t>
+      </w:r>
+      <w:proofErr w:type="spellEnd"/>
+      <w:r>
+        <w:t xml:space="preserve">(output, </w:t>
+      </w:r>
+      <w:proofErr w:type="spellStart"/>
+      <w:r>
+        <w:t>download_name</w:t>
+      </w:r>
+      <w:proofErr w:type="spellEnd"/>
+      <w:r>
+        <w:t xml:space="preserve">="inventory.xlsx", </w:t>
+      </w:r>
+      <w:proofErr w:type="spellStart"/>
+      <w:r>
+        <w:t>as_attachment</w:t>
+      </w:r>
+      <w:proofErr w:type="spellEnd"/>
+      <w:r>
+        <w:t>=True)</w:t>
       </w:r>
       <w:r>
         <w:br/>
@@ -3377,21 +5587,45 @@
       </w:r>
       <w:r>
         <w:br/>
-        <w:t xml:space="preserve">    init_db()</w:t>
-      </w:r>
-      <w:r>
-        <w:br/>
-        <w:t xml:space="preserve">    port = int(os.environ.get("PORT", 10000))</w:t>
-      </w:r>
-      <w:r>
-        <w:br/>
-        <w:t xml:space="preserve">    app.run(host="0.0.0.0", port=port)</w:t>
+        <w:t xml:space="preserve">    </w:t>
+      </w:r>
+      <w:proofErr w:type="spellStart"/>
+      <w:r>
+        <w:t>init_db</w:t>
+      </w:r>
+      <w:proofErr w:type="spellEnd"/>
+      <w:r>
+        <w:t>()</w:t>
+      </w:r>
+      <w:r>
+        <w:br/>
+        <w:t xml:space="preserve">    port = int(</w:t>
+      </w:r>
+      <w:proofErr w:type="spellStart"/>
+      <w:r>
+        <w:t>os.environ.get</w:t>
+      </w:r>
+      <w:proofErr w:type="spellEnd"/>
+      <w:r>
+        <w:t>("PORT", 10000))</w:t>
+      </w:r>
+      <w:r>
+        <w:br/>
+        <w:t xml:space="preserve">    </w:t>
+      </w:r>
+      <w:proofErr w:type="spellStart"/>
+      <w:r>
+        <w:t>app.run</w:t>
+      </w:r>
+      <w:proofErr w:type="spellEnd"/>
+      <w:r>
+        <w:t>(host="0.0.0.0", port=port)</w:t>
       </w:r>
     </w:p>
     <w:p>
       <w:r>
         <w:pict w14:anchorId="2B41BF56">
-          <v:rect id="_x0000_i1138" style="width:0;height:1.5pt" o:hralign="center" o:hrstd="t" o:hr="t" fillcolor="#a0a0a0" stroked="f"/>
+          <v:rect id="_x0000_i1042" style="width:0;height:1.5pt" o:hralign="center" o:hrstd="t" o:hr="t" fillcolor="#a0a0a0" stroked="f"/>
         </w:pict>
       </w:r>
     </w:p>
@@ -3426,7 +5660,7 @@
     <w:p>
       <w:r>
         <w:pict w14:anchorId="14561020">
-          <v:rect id="_x0000_i1139" style="width:0;height:1.5pt" o:hralign="center" o:hrstd="t" o:hr="t" fillcolor="#a0a0a0" stroked="f"/>
+          <v:rect id="_x0000_i1043" style="width:0;height:1.5pt" o:hralign="center" o:hrstd="t" o:hr="t" fillcolor="#a0a0a0" stroked="f"/>
         </w:pict>
       </w:r>
     </w:p>
@@ -3519,7 +5753,7 @@
     <w:p>
       <w:r>
         <w:pict w14:anchorId="44B552D9">
-          <v:rect id="_x0000_i1140" style="width:0;height:1.5pt" o:hralign="center" o:hrstd="t" o:hr="t" fillcolor="#a0a0a0" stroked="f"/>
+          <v:rect id="_x0000_i1044" style="width:0;height:1.5pt" o:hralign="center" o:hrstd="t" o:hr="t" fillcolor="#a0a0a0" stroked="f"/>
         </w:pict>
       </w:r>
     </w:p>
@@ -3598,7 +5832,7 @@
     <w:p>
       <w:r>
         <w:pict w14:anchorId="7B3823A6">
-          <v:rect id="_x0000_i1141" style="width:0;height:1.5pt" o:hralign="center" o:hrstd="t" o:hr="t" fillcolor="#a0a0a0" stroked="f"/>
+          <v:rect id="_x0000_i1045" style="width:0;height:1.5pt" o:hralign="center" o:hrstd="t" o:hr="t" fillcolor="#a0a0a0" stroked="f"/>
         </w:pict>
       </w:r>
     </w:p>
@@ -3671,7 +5905,7 @@
     <w:p>
       <w:r>
         <w:pict w14:anchorId="33BC88D2">
-          <v:rect id="_x0000_i1142" style="width:0;height:1.5pt" o:hralign="center" o:hrstd="t" o:hr="t" fillcolor="#a0a0a0" stroked="f"/>
+          <v:rect id="_x0000_i1046" style="width:0;height:1.5pt" o:hralign="center" o:hrstd="t" o:hr="t" fillcolor="#a0a0a0" stroked="f"/>
         </w:pict>
       </w:r>
     </w:p>
@@ -3701,13 +5935,26 @@
       </w:r>
       <w:r>
         <w:br/>
-        <w:t>Start Command: gunicorn app:app</w:t>
-      </w:r>
+        <w:t xml:space="preserve">Start Command: </w:t>
+      </w:r>
+      <w:proofErr w:type="spellStart"/>
+      <w:r>
+        <w:t>gunicorn</w:t>
+      </w:r>
+      <w:proofErr w:type="spellEnd"/>
+      <w:r>
+        <w:t xml:space="preserve"> </w:t>
+      </w:r>
+      <w:proofErr w:type="spellStart"/>
+      <w:r>
+        <w:t>app:app</w:t>
+      </w:r>
+      <w:proofErr w:type="spellEnd"/>
     </w:p>
     <w:p>
       <w:r>
         <w:pict w14:anchorId="62D9C152">
-          <v:rect id="_x0000_i1143" style="width:0;height:1.5pt" o:hralign="center" o:hrstd="t" o:hr="t" fillcolor="#a0a0a0" stroked="f"/>
+          <v:rect id="_x0000_i1047" style="width:0;height:1.5pt" o:hralign="center" o:hrstd="t" o:hr="t" fillcolor="#a0a0a0" stroked="f"/>
         </w:pict>
       </w:r>
     </w:p>
@@ -3783,12 +6030,22 @@
       </w:r>
       <w:r>
         <w:br/>
-        <w:t>APP_USER = yourusername</w:t>
-      </w:r>
-      <w:r>
-        <w:br/>
-        <w:t>APP_PASS = yourstrongpassword</w:t>
-      </w:r>
+        <w:t xml:space="preserve">APP_USER = </w:t>
+      </w:r>
+      <w:proofErr w:type="spellStart"/>
+      <w:r>
+        <w:t>yourusername</w:t>
+      </w:r>
+      <w:proofErr w:type="spellEnd"/>
+      <w:r>
+        <w:br/>
+        <w:t xml:space="preserve">APP_PASS = </w:t>
+      </w:r>
+      <w:proofErr w:type="spellStart"/>
+      <w:r>
+        <w:t>yourstrongpassword</w:t>
+      </w:r>
+      <w:proofErr w:type="spellEnd"/>
     </w:p>
     <w:p>
       <w:pPr>
@@ -3811,8 +6068,13 @@
       </w:r>
       <w:r>
         <w:br/>
-        <w:t>APP_USER = bhooshan</w:t>
-      </w:r>
+        <w:t xml:space="preserve">APP_USER = </w:t>
+      </w:r>
+      <w:proofErr w:type="spellStart"/>
+      <w:r>
+        <w:t>bhooshan</w:t>
+      </w:r>
+      <w:proofErr w:type="spellEnd"/>
       <w:r>
         <w:br/>
         <w:t>APP_PASS = Kilwins@123</w:t>
@@ -3821,7 +6083,7 @@
     <w:p>
       <w:r>
         <w:pict w14:anchorId="56DA493E">
-          <v:rect id="_x0000_i1144" style="width:0;height:1.5pt" o:hralign="center" o:hrstd="t" o:hr="t" fillcolor="#a0a0a0" stroked="f"/>
+          <v:rect id="_x0000_i1048" style="width:0;height:1.5pt" o:hralign="center" o:hrstd="t" o:hr="t" fillcolor="#a0a0a0" stroked="f"/>
         </w:pict>
       </w:r>
     </w:p>
@@ -3868,7 +6130,7 @@
     <w:p>
       <w:r>
         <w:pict w14:anchorId="0F38C34A">
-          <v:rect id="_x0000_i1145" style="width:0;height:1.5pt" o:hralign="center" o:hrstd="t" o:hr="t" fillcolor="#a0a0a0" stroked="f"/>
+          <v:rect id="_x0000_i1049" style="width:0;height:1.5pt" o:hralign="center" o:hrstd="t" o:hr="t" fillcolor="#a0a0a0" stroked="f"/>
         </w:pict>
       </w:r>
     </w:p>
@@ -3975,7 +6237,15 @@
         <w:t>💻</w:t>
       </w:r>
       <w:r>
-        <w:t xml:space="preserve"> No ngrok needed </w:t>
+        <w:t xml:space="preserve"> No </w:t>
+      </w:r>
+      <w:proofErr w:type="spellStart"/>
+      <w:r>
+        <w:t>ngrok</w:t>
+      </w:r>
+      <w:proofErr w:type="spellEnd"/>
+      <w:r>
+        <w:t xml:space="preserve"> needed </w:t>
       </w:r>
     </w:p>
     <w:p>
@@ -3998,7 +6268,7 @@
     <w:p>
       <w:r>
         <w:pict w14:anchorId="0FA8B9B7">
-          <v:rect id="_x0000_i1146" style="width:0;height:1.5pt" o:hralign="center" o:hrstd="t" o:hr="t" fillcolor="#a0a0a0" stroked="f"/>
+          <v:rect id="_x0000_i1050" style="width:0;height:1.5pt" o:hralign="center" o:hrstd="t" o:hr="t" fillcolor="#a0a0a0" stroked="f"/>
         </w:pict>
       </w:r>
     </w:p>
@@ -4091,7 +6361,7 @@
     <w:p>
       <w:r>
         <w:pict w14:anchorId="56E94E10">
-          <v:rect id="_x0000_i1147" style="width:0;height:1.5pt" o:hralign="center" o:hrstd="t" o:hr="t" fillcolor="#a0a0a0" stroked="f"/>
+          <v:rect id="_x0000_i1051" style="width:0;height:1.5pt" o:hralign="center" o:hrstd="t" o:hr="t" fillcolor="#a0a0a0" stroked="f"/>
         </w:pict>
       </w:r>
     </w:p>
@@ -4195,7 +6465,7 @@
     <w:p>
       <w:r>
         <w:pict w14:anchorId="4F649893">
-          <v:rect id="_x0000_i1148" style="width:0;height:1.5pt" o:hralign="center" o:hrstd="t" o:hr="t" fillcolor="#a0a0a0" stroked="f"/>
+          <v:rect id="_x0000_i1052" style="width:0;height:1.5pt" o:hralign="center" o:hrstd="t" o:hr="t" fillcolor="#a0a0a0" stroked="f"/>
         </w:pict>
       </w:r>
     </w:p>
@@ -7169,6 +9439,7 @@
   <w:style w:type="character" w:default="1" w:styleId="DefaultParagraphFont">
     <w:name w:val="Default Paragraph Font"/>
     <w:uiPriority w:val="1"/>
+    <w:semiHidden/>
     <w:unhideWhenUsed/>
   </w:style>
   <w:style w:type="table" w:default="1" w:styleId="TableNormal">
@@ -7658,6 +9929,18 @@
     <w:basedOn w:val="DefaultParagraphFont"/>
     <w:rsid w:val="006D0C90"/>
   </w:style>
+  <w:style w:type="character" w:styleId="FollowedHyperlink">
+    <w:name w:val="FollowedHyperlink"/>
+    <w:basedOn w:val="DefaultParagraphFont"/>
+    <w:uiPriority w:val="99"/>
+    <w:semiHidden/>
+    <w:unhideWhenUsed/>
+    <w:rsid w:val="00B16464"/>
+    <w:rPr>
+      <w:color w:val="96607D" w:themeColor="followedHyperlink"/>
+      <w:u w:val="single"/>
+    </w:rPr>
+  </w:style>
 </w:styles>
 </file>
 

</xml_diff>